<commit_message>
Manuscript: drop denial-reason breakdown from text, Fig. 1 and subgroup table
Co-Authored-By: Claude Fable 5.1 <noreply@anthropic.com>
Claude-Session: https://claude.ai/code/session_01Aiw93QsZZztot1nhJhBDLx
</commit_message>
<xml_diff>
--- a/docs/OrthoAppeals-Manuscript.docx
+++ b/docs/OrthoAppeals-Manuscript.docx
@@ -111,7 +111,7 @@
         <w:rPr>
           <w:i w:val="0"/>
         </w:rPr>
-        <w:t>Each case comprised a denial notice (reason, appeal deadline, member and reference identifiers) and a one-page clinical summary for one denied orthopedic operation. Cases covered 51 jurisdictions, 73 insurers (152 commercial, 15 Medicaid), 14 operations and four denial reasons in near-equal numbers (inadequate conservative treatment, imaging, not medically necessary, incomplete documentation). Cases were stratified by what the plan publishes: criteria for the operation (stratum A, n = 120); a policy naming the operation that applies licensed criteria (stratum B, n = 12); or no policy (stratum C, n = 35). The governing document for each stratum-A case (46 distinct documents) was verified against the full policy text before scoring.</w:t>
+        <w:t>Each case comprised a denial notice (reason, appeal deadline, member and reference identifiers) and a one-page clinical summary for one denied orthopedic operation. Cases covered 51 jurisdictions, 73 insurers (152 commercial, 15 Medicaid) and 14 operations. Cases were stratified by what the plan publishes: criteria for the operation (stratum A, n = 120); a policy naming the operation that applies licensed criteria (stratum B, n = 12); or no policy (stratum C, n = 35). The governing document for each stratum-A case (46 distinct documents) was verified against the full policy text before scoring.</w:t>
       </w:r>
     </w:p>
     <w:p>
@@ -159,7 +159,7 @@
         <w:rPr>
           <w:i w:val="0"/>
         </w:rPr>
-        <w:t>Proportions are given with Wilson 95% confidence intervals. Differences among the four systems on each binary outcome were tested with Cochran's Q, followed by all six pairwise exact McNemar tests on discordant pairs, with the difference in proportions and a bootstrap 95% CI (10,000 resamples). Completeness and effort were compared with the Friedman test and pairwise Wilcoxon signed-rank tests. Within each system, identification was compared across strata and plan types and letter grounding across denial reasons with chi-square or Fisher's exact tests. P values were Holm-adjusted within each family of pairwise tests. All tests were two-sided at α = 0.05. Analyses used Python 3.10 and SciPy.</w:t>
+        <w:t>Proportions are given with Wilson 95% confidence intervals. Differences among the four systems on each binary outcome were tested with Cochran's Q, followed by all six pairwise exact McNemar tests on discordant pairs, with the difference in proportions and a bootstrap 95% CI (10,000 resamples). Completeness and effort were compared with the Friedman test and pairwise Wilcoxon signed-rank tests. Within each system, identification was compared across strata and plan types with chi-square or Fisher's exact tests. P values were Holm-adjusted within each family of pairwise tests. All tests were two-sided at α = 0.05. Analyses used Python 3.10 and SciPy.</w:t>
       </w:r>
     </w:p>
     <w:p>
@@ -191,7 +191,7 @@
         <w:rPr>
           <w:i w:val="0"/>
         </w:rPr>
-        <w:t>Appeal letters. In stratum A, the letter quoted a criterion answering the denial reason in 119 of 120 (99%) OrthoAppeals cases, 109 of 120 (91%) Gemini, 80 of 120 (67%) Claude and 30 of 120 (25%) ChatGPT (Q = 176.0, P &lt; 0.001; Table 3, Fig. 2b); every pairwise difference was significant (all Holm-adjusted P ≤ 0.002; Table 4). Grounding did not vary by denial reason within any system (all P ≥ 0.73). A quotation found in neither the governing document nor the cited document appeared in 55 of 120 (46%) Claude letters, 51 of 120 (42%) Gemini, 9 of 120 (8%) ChatGPT and 0 OrthoAppeals (95% CI 0–3%; Q = 107.9, P &lt; 0.001). Claude and Gemini did not differ (P = 0.66); each exceeded ChatGPT (P &lt; 0.001 and P &lt; 0.001) and OrthoAppeals (both P &lt; 0.001). An invented policy number or effective date appeared in 34 of 167 (20%) Gemini, 32 of 167 (19%) Claude, 8 of 167 (5%) ChatGPT and 0 OrthoAppeals letters (Q = 61.8, P &lt; 0.001).</w:t>
+        <w:t>Appeal letters. In stratum A, the letter quoted a criterion answering the denial reason in 119 of 120 (99%) OrthoAppeals cases, 109 of 120 (91%) Gemini, 80 of 120 (67%) Claude and 30 of 120 (25%) ChatGPT (Q = 176.0, P &lt; 0.001; Table 3, Fig. 2b); every pairwise difference was significant (all Holm-adjusted P ≤ 0.002; Table 4). A quotation found in neither the governing document nor the cited document appeared in 55 of 120 (46%) Claude letters, 51 of 120 (42%) Gemini, 9 of 120 (8%) ChatGPT and 0 OrthoAppeals (95% CI 0–3%; Q = 107.9, P &lt; 0.001). Claude and Gemini did not differ (P = 0.66); each exceeded ChatGPT (P &lt; 0.001 and P &lt; 0.001) and OrthoAppeals (both P &lt; 0.001). An invented policy number or effective date appeared in 34 of 167 (20%) Gemini, 32 of 167 (19%) Claude, 8 of 167 (5%) ChatGPT and 0 OrthoAppeals letters (Q = 61.8, P &lt; 0.001).</w:t>
       </w:r>
     </w:p>
     <w:p>
@@ -9211,238 +9211,6 @@
                 <w:sz w:val="18"/>
               </w:rPr>
               <w:t>P &lt; 0.001</w:t>
-            </w:r>
-          </w:p>
-        </w:tc>
-      </w:tr>
-      <w:tr>
-        <w:tc>
-          <w:tcPr>
-            <w:tcW w:type="dxa" w:w="2160"/>
-          </w:tcPr>
-          <w:p>
-            <w:r/>
-            <w:r>
-              <w:rPr>
-                <w:sz w:val="18"/>
-              </w:rPr>
-              <w:t xml:space="preserve">   Grounded letter by denial reason (stratum A): OrthoAppeals</w:t>
-            </w:r>
-          </w:p>
-        </w:tc>
-        <w:tc>
-          <w:tcPr>
-            <w:tcW w:type="dxa" w:w="2160"/>
-          </w:tcPr>
-          <w:p>
-            <w:r/>
-            <w:r>
-              <w:rPr>
-                <w:sz w:val="18"/>
-              </w:rPr>
-              <w:t>30/31 / 30/30 / 30/30 / 29/29</w:t>
-            </w:r>
-          </w:p>
-        </w:tc>
-        <w:tc>
-          <w:tcPr>
-            <w:tcW w:type="dxa" w:w="2160"/>
-          </w:tcPr>
-          <w:p>
-            <w:r/>
-            <w:r>
-              <w:rPr>
-                <w:sz w:val="18"/>
-              </w:rPr>
-              <w:t>chi-square</w:t>
-            </w:r>
-          </w:p>
-        </w:tc>
-        <w:tc>
-          <w:tcPr>
-            <w:tcW w:type="dxa" w:w="2160"/>
-          </w:tcPr>
-          <w:p>
-            <w:r/>
-            <w:r>
-              <w:rPr>
-                <w:sz w:val="18"/>
-              </w:rPr>
-              <w:t>P = 0.93</w:t>
-            </w:r>
-          </w:p>
-        </w:tc>
-      </w:tr>
-      <w:tr>
-        <w:tc>
-          <w:tcPr>
-            <w:tcW w:type="dxa" w:w="2160"/>
-          </w:tcPr>
-          <w:p>
-            <w:r/>
-            <w:r>
-              <w:rPr>
-                <w:sz w:val="18"/>
-              </w:rPr>
-              <w:t xml:space="preserve">   Grounded letter by denial reason (stratum A): ChatGPT</w:t>
-            </w:r>
-          </w:p>
-        </w:tc>
-        <w:tc>
-          <w:tcPr>
-            <w:tcW w:type="dxa" w:w="2160"/>
-          </w:tcPr>
-          <w:p>
-            <w:r/>
-            <w:r>
-              <w:rPr>
-                <w:sz w:val="18"/>
-              </w:rPr>
-              <w:t>6/31 / 7/30 / 10/30 / 7/29</w:t>
-            </w:r>
-          </w:p>
-        </w:tc>
-        <w:tc>
-          <w:tcPr>
-            <w:tcW w:type="dxa" w:w="2160"/>
-          </w:tcPr>
-          <w:p>
-            <w:r/>
-            <w:r>
-              <w:rPr>
-                <w:sz w:val="18"/>
-              </w:rPr>
-              <w:t>chi-square</w:t>
-            </w:r>
-          </w:p>
-        </w:tc>
-        <w:tc>
-          <w:tcPr>
-            <w:tcW w:type="dxa" w:w="2160"/>
-          </w:tcPr>
-          <w:p>
-            <w:r/>
-            <w:r>
-              <w:rPr>
-                <w:sz w:val="18"/>
-              </w:rPr>
-              <w:t>P = 0.93</w:t>
-            </w:r>
-          </w:p>
-        </w:tc>
-      </w:tr>
-      <w:tr>
-        <w:tc>
-          <w:tcPr>
-            <w:tcW w:type="dxa" w:w="2160"/>
-          </w:tcPr>
-          <w:p>
-            <w:r/>
-            <w:r>
-              <w:rPr>
-                <w:sz w:val="18"/>
-              </w:rPr>
-              <w:t xml:space="preserve">   Grounded letter by denial reason (stratum A): Claude</w:t>
-            </w:r>
-          </w:p>
-        </w:tc>
-        <w:tc>
-          <w:tcPr>
-            <w:tcW w:type="dxa" w:w="2160"/>
-          </w:tcPr>
-          <w:p>
-            <w:r/>
-            <w:r>
-              <w:rPr>
-                <w:sz w:val="18"/>
-              </w:rPr>
-              <w:t>22/31 / 17/30 / 24/30 / 17/29</w:t>
-            </w:r>
-          </w:p>
-        </w:tc>
-        <w:tc>
-          <w:tcPr>
-            <w:tcW w:type="dxa" w:w="2160"/>
-          </w:tcPr>
-          <w:p>
-            <w:r/>
-            <w:r>
-              <w:rPr>
-                <w:sz w:val="18"/>
-              </w:rPr>
-              <w:t>chi-square</w:t>
-            </w:r>
-          </w:p>
-        </w:tc>
-        <w:tc>
-          <w:tcPr>
-            <w:tcW w:type="dxa" w:w="2160"/>
-          </w:tcPr>
-          <w:p>
-            <w:r/>
-            <w:r>
-              <w:rPr>
-                <w:sz w:val="18"/>
-              </w:rPr>
-              <w:t>P = 0.73</w:t>
-            </w:r>
-          </w:p>
-        </w:tc>
-      </w:tr>
-      <w:tr>
-        <w:tc>
-          <w:tcPr>
-            <w:tcW w:type="dxa" w:w="2160"/>
-          </w:tcPr>
-          <w:p>
-            <w:r/>
-            <w:r>
-              <w:rPr>
-                <w:sz w:val="18"/>
-              </w:rPr>
-              <w:t xml:space="preserve">   Grounded letter by denial reason (stratum A): Gemini</w:t>
-            </w:r>
-          </w:p>
-        </w:tc>
-        <w:tc>
-          <w:tcPr>
-            <w:tcW w:type="dxa" w:w="2160"/>
-          </w:tcPr>
-          <w:p>
-            <w:r/>
-            <w:r>
-              <w:rPr>
-                <w:sz w:val="18"/>
-              </w:rPr>
-              <w:t>29/31 / 25/30 / 29/30 / 26/29</w:t>
-            </w:r>
-          </w:p>
-        </w:tc>
-        <w:tc>
-          <w:tcPr>
-            <w:tcW w:type="dxa" w:w="2160"/>
-          </w:tcPr>
-          <w:p>
-            <w:r/>
-            <w:r>
-              <w:rPr>
-                <w:sz w:val="18"/>
-              </w:rPr>
-              <w:t>chi-square</w:t>
-            </w:r>
-          </w:p>
-        </w:tc>
-        <w:tc>
-          <w:tcPr>
-            <w:tcW w:type="dxa" w:w="2160"/>
-          </w:tcPr>
-          <w:p>
-            <w:r/>
-            <w:r>
-              <w:rPr>
-                <w:sz w:val="18"/>
-              </w:rPr>
-              <w:t>P = 0.93</w:t>
             </w:r>
           </w:p>
         </w:tc>

</xml_diff>

<commit_message>
Live site answers the policy and writes the letter exactly as the study did
- synthetic_harness/directory_lookup.py: the study's OrthoAppeals lookup and
  letter shaping, moved out of scripts/study so the site and the study run
  the same code
- server: at intake, answer from the directory for every status the study
  tested; the policy shown and the letter come from it; the search agent is
  told the policy and still writes the step-by-step plan; untested statuses
  and plans with no row fall back to search as before
- tests/test_directory_lookup.py: all 167 study cases produce the identical
  policy answer and letter input through the live entry point
- tests/test_providers.py: expectations updated for recorded cache tokens
- manuscript drafts no longer tracked

Co-Authored-By: Claude Opus 5.5 <noreply@anthropic.com>
Claude-Session: https://claude.ai/code/session_01Aiw93QsZZztot1nhJhBDLx
</commit_message>
<xml_diff>
--- a/docs/OrthoAppeals-Manuscript.docx
+++ b/docs/OrthoAppeals-Manuscript.docx
@@ -7,7 +7,7 @@
         <w:pStyle w:val="Heading1"/>
       </w:pPr>
       <w:r>
-        <w:t>Policy-Grounded Versus General-Purpose AI for Orthopedic Surgery Appeals: A Paired Comparison on 167 Simulated Denials</w:t>
+        <w:t>Policy-Grounded Versus General-Purpose AI for Orthopedic Surgery Appeals. A Paired Comparison on 167 Simulated Denials</w:t>
       </w:r>
     </w:p>
     <w:p>
@@ -23,13 +23,10 @@
         <w:rPr>
           <w:b/>
         </w:rPr>
-        <w:t xml:space="preserve">Background: </w:t>
+        <w:t xml:space="preserve">Background. </w:t>
       </w:r>
       <w:r>
-        <w:rPr>
-          <w:i w:val="0"/>
-        </w:rPr>
-        <w:t>Patients who appeal a denied orthopedic operation must show that they meet the criteria in their health plan's medical policy. We compared OrthoAppeals, which retrieves the governing policy from a curated directory and drafts the appeal from the policy's text, with three free general-purpose chatbots given web search.</w:t>
+        <w:t>Patients and physicians increasingly turn to AI chatbots to fight insurance denials. General-purpose chatbots do not always have access to the health plan's medical policy and can hallucinate criteria that the policy does not contain. OrthoAppeals retrieves the plan's governing policy from a curated directory and drafts the appeal from the policy's own text. We compared it with the flagship models behind ChatGPT, Claude and Gemini.</w:t>
       </w:r>
     </w:p>
     <w:p>
@@ -37,13 +34,10 @@
         <w:rPr>
           <w:b/>
         </w:rPr>
-        <w:t xml:space="preserve">Methods: </w:t>
+        <w:t xml:space="preserve">Methods. </w:t>
       </w:r>
       <w:r>
-        <w:rPr>
-          <w:i w:val="0"/>
-        </w:rPr>
-        <w:t>We generated 167 simulated denials across 51 jurisdictions, 73 insurers and 14 operations: the plan publishes criteria (stratum A, n = 120), the plan's policy defers to vendor-held criteria (stratum B, n = 12), or no policy exists (stratum C, n = 35). Each case was answered by OrthoAppeals, ChatGPT, Claude and Gemini. The primary outcome was correct identification of the governing policy against a reviewed answer key; letter outcomes were scored by code against the policy text. Systems were compared with Cochran's Q and exact McNemar tests, Friedman and Wilcoxon signed-rank tests, and Holm-adjusted P values.</w:t>
+        <w:t>We generated 167 simulated denials based on real denial scenarios, spanning 51 jurisdictions, 73 insurers and 14 orthopedic operations. Each case was answered by OrthoAppeals and by ChatGPT, Claude and Gemini with web search. For every case we measured whether the system identified the plan's governing policy and whether its appeal letter quoted that policy accurately, hallucinated policy text or a policy that did not exist, stated the filing deadline and appeal route, and was ready to send. Every letter was checked by code against the actual policy text. Systems were compared with Cochran's Q, exact McNemar, Friedman and Wilcoxon signed-rank tests with Holm adjustment.</w:t>
       </w:r>
     </w:p>
     <w:p>
@@ -51,13 +45,10 @@
         <w:rPr>
           <w:b/>
         </w:rPr>
-        <w:t xml:space="preserve">Results: </w:t>
+        <w:t xml:space="preserve">Results. </w:t>
       </w:r>
       <w:r>
-        <w:rPr>
-          <w:i w:val="0"/>
-        </w:rPr>
-        <w:t>OrthoAppeals identified the governing policy in 167 of 167 (100%) cases, ChatGPT in 106 of 167 (63%), Claude in 140 of 167 (84%) and Gemini in 138 of 167 (83%) (Q = 81.5, P &lt; 0.001; each versus OrthoAppeals, P &lt; 0.001). In stratum A, OrthoAppeals quoted a criterion answering the denial in 119 of 120 (99%) letters, Gemini in 109 of 120 (91%), Claude in 80 of 120 (67%) and ChatGPT in 30 of 120 (25%) (Q = 176.0, P &lt; 0.001). Quotations absent from the policy appeared in 0 OrthoAppeals, 9 ChatGPT, 55 Claude and 51 Gemini letters (Q = 107.9, P &lt; 0.001). In stratum C, Gemini cited a nonexistent document in 19 of 35 (54%) cases. Judged completeness differed across systems (Friedman P &lt; 0.001).</w:t>
+        <w:t>OrthoAppeals identified the governing policy in 167 of 167 (100%) cases, ChatGPT in 106 of 167 (63%), Claude in 140 of 167 (84%) and Gemini in 138 of 167 (83%) (each versus OrthoAppeals, P &lt; 0.001). Where the plan published criteria, OrthoAppeals quoted a criterion answering the denial in 119 of 120 (99%) letters, Gemini in 109 of 120 (91%), Claude in 80 of 120 (67%) and ChatGPT in 30 of 120 (25%) (P &lt; 0.001). Hallucinated quotations, text attributed to the policy that the policy does not contain, appeared in 0 OrthoAppeals letters and in 8% of ChatGPT, 46% of Claude and 42% of Gemini letters (P &lt; 0.001). Where no policy existed, Gemini cited a policy that did not exist in 19 of 35 (54%) cases. OrthoAppeals stated the filing deadline in every letter, the chatbots in 14% to 95%.</w:t>
       </w:r>
     </w:p>
     <w:p>
@@ -65,13 +56,10 @@
         <w:rPr>
           <w:b/>
         </w:rPr>
-        <w:t xml:space="preserve">Conclusions: </w:t>
+        <w:t xml:space="preserve">Conclusions. </w:t>
       </w:r>
       <w:r>
-        <w:rPr>
-          <w:i w:val="0"/>
-        </w:rPr>
-        <w:t>A directory-grounded tool identified the governing policy and quoted it accurately in nearly every case; free chatbots missed the policy in one sixth to one third of cases and, when they quoted it, often quoted text that was not there.</w:t>
+        <w:t>OrthoAppeals identified the governing policy and quoted it accurately in nearly every case. The chatbots missed the policy in 16% to 37% of cases and hallucinated policy text in up to 46% of letters. An appeal built on criteria the plan never wrote can be denied on that basis alone, so patients and physicians who rely on general-purpose chatbots risk submitting appeals that misstate the plan's own rules. Grounding the appeal in the plan's published policy removes that failure.</w:t>
       </w:r>
     </w:p>
     <w:p>
@@ -92,10 +80,7 @@
     </w:p>
     <w:p>
       <w:r>
-        <w:rPr>
-          <w:i w:val="0"/>
-        </w:rPr>
-        <w:t>Paired comparison of four systems on 167 simulated denials. Every case was answered by every system, and all comparisons are between answers to the same case. No patient data were used.</w:t>
+        <w:t>We compared four systems on the same 167 simulated denials. Every system answered every case, so each comparison is between two answers to the same case. No patient data were used.</w:t>
       </w:r>
     </w:p>
     <w:p>
@@ -108,10 +93,20 @@
     </w:p>
     <w:p>
       <w:r>
-        <w:rPr>
-          <w:i w:val="0"/>
-        </w:rPr>
-        <w:t>Each case comprised a denial notice (reason, appeal deadline, member and reference identifiers) and a one-page clinical summary for one denied orthopedic operation. Cases covered 51 jurisdictions, 73 insurers (152 commercial, 15 Medicaid) and 14 operations. Cases were stratified by what the plan publishes: criteria for the operation (stratum A, n = 120); a policy naming the operation that applies licensed criteria (stratum B, n = 12); or no policy (stratum C, n = 35). The governing document for each stratum-A case (46 distinct documents) was verified against the full policy text before scoring.</w:t>
+        <w:t>Each case was a simulated denial of one orthopedic operation, modeled on real denial scenarios. It included the denial letter, with the reason for denial, the appeal deadline and the member and reference numbers, and a one-page clinical summary of a patient who met the usual criteria for the operation. The 167 cases covered 51 jurisdictions, 73 insurers (152 commercial, 15 Medicaid) and 14 operations. The denial reasons were based on the reasons recorded in real denials at a single institution, namely inadequate conservative treatment (42 cases), imaging not supporting surgery (42), not medically necessary (42) and incomplete documentation (41).</w:t>
+      </w:r>
+    </w:p>
+    <w:p>
+      <w:pPr>
+        <w:pStyle w:val="Heading3"/>
+      </w:pPr>
+      <w:r>
+        <w:t>Why cases were grouped by what the plan publishes</w:t>
+      </w:r>
+    </w:p>
+    <w:p>
+      <w:r>
+        <w:t>An appeal can only quote the plan's criteria if the plan makes them public, and what counts as a correct answer changes with that. We therefore grouped cases into three strata. In stratum A the plan, or the review company it uses, publishes the criteria for the operation (n = 120), and the correct answer is to cite and quote them. In stratum B the plan's published policy names the operation but applies licensed criteria (InterQual, MCG or TurningPoint) that are not public (n = 12), and the correct answer is to cite the policy and ask the plan for the criteria. In stratum C the plan publishes no policy for the operation (n = 35), and the correct answer is to say so and ask for the criteria in writing. In stratum C, naming a specific policy as the governing one is a hallucination. The governing document for every stratum-A case (46 distinct documents) was checked against the full policy text before scoring.</w:t>
       </w:r>
     </w:p>
     <w:p>
@@ -124,10 +119,7 @@
     </w:p>
     <w:p>
       <w:r>
-        <w:rPr>
-          <w:i w:val="0"/>
-        </w:rPr>
-        <w:t>OrthoAppeals retrieves the case's governing policy from its directory, extracts the verbatim criteria for the operation, and drafts a first-person appeal with a language model (Claude Opus 5) that is given only those excerpts, the notice and the clinical summary; automated checks flag any rule, number or quotation attributed to the plan that is not in the excerpts, and the writer revises once. The comparators were the models behind the free tiers of ChatGPT (GPT-5.6), Claude (Sonnet 5) and Gemini (3.5 Flash) in September 2026, run through their vendors' APIs with identical tools (web search and page fetch), identical instructions and a budget of 120 tool calls. Each chatbot identified the policy and then drafted the appeal letter in the same conversation.</w:t>
+        <w:t>OrthoAppeals looks the plan and operation up in its policy directory, pulls the plan's own criteria for that operation word for word, and drafts a first-person appeal from those criteria, the denial letter and the clinical summary using a language model (Claude Opus 5). Automated checks then flag any rule, number or quotation the letter attributes to the plan that is not in the criteria, and the letter is revised once. The comparators were the flagship models behind ChatGPT (GPT-5.6), Claude (Sonnet 5) and Gemini (3.5 Flash) in September 2026, each given web search and page reading and the same instructions, mimicking the free patient experience. Each chatbot was asked to find the plan's governing policy and then to write the appeal letter in the same conversation.</w:t>
       </w:r>
     </w:p>
     <w:p>
@@ -135,15 +127,12 @@
         <w:pStyle w:val="Heading3"/>
       </w:pPr>
       <w:r>
-        <w:t>Outcomes</w:t>
+        <w:t>What we measured</w:t>
       </w:r>
     </w:p>
     <w:p>
       <w:r>
-        <w:rPr>
-          <w:i w:val="0"/>
-        </w:rPr>
-        <w:t>The primary outcome was correct identification of the governing policy: the answer-key document, another edition of the same publisher's guideline, or an accepted alternate. In stratum C, citing a specific policy as governing was scored as a nonexistent document. Letter outcomes were scored by code against the policy text and the notice: quotes a criterion answering the stated denial reason (stratum A); any quotation not found in the policy; invented policy number or effective date; filing deadline stated; appeal route stated; sendable (identifiers present, no placeholders); and, in stratum C, asks the plan for its criteria and cites a nonexistent document. A model-based grader rated completeness (0–4). Effort was the number of web searches and page fetches per case.</w:t>
+        <w:t>For every case we recorded whether the system identified the governing policy. A citation counted if it was the policy in the answer key, another edition of the same publisher's guideline, or an accepted alternate. For every letter we recorded whether it quoted a criterion that answered the reason for denial, whether every quotation it attributed to the policy actually appeared in the policy (a quotation that did not is a hallucination), whether it invented a policy number or effective date, whether it stated the filing deadline and where to send the appeal, and whether it was ready to send, meaning the member and reference numbers were present and no placeholder remained. In stratum C we also recorded whether the letter asked the plan for its criteria and whether it cited a policy that did not exist. Code checked each of these against the policy text and the denial letter. A separate model rated each letter's completeness from 0 to 4. We also counted how many web searches and page visits each chatbot made per case.</w:t>
       </w:r>
     </w:p>
     <w:p>
@@ -156,10 +145,7 @@
     </w:p>
     <w:p>
       <w:r>
-        <w:rPr>
-          <w:i w:val="0"/>
-        </w:rPr>
-        <w:t>Proportions are given with Wilson 95% confidence intervals. Differences among the four systems on each binary outcome were tested with Cochran's Q, followed by all six pairwise exact McNemar tests on discordant pairs, with the difference in proportions and a bootstrap 95% CI (10,000 resamples). Completeness and effort were compared with the Friedman test and pairwise Wilcoxon signed-rank tests. Within each system, identification was compared across strata and plan types with chi-square or Fisher's exact tests. P values were Holm-adjusted within each family of pairwise tests. All tests were two-sided at α = 0.05. Analyses used Python 3.10 and SciPy.</w:t>
+        <w:t>Proportions are given with Wilson 95% confidence intervals. Differences among the four systems on each yes-or-no measure were tested with Cochran's Q, followed by all six pairwise exact McNemar tests on discordant pairs, with the difference in proportions and a bootstrap 95% CI from 10,000 resamples. Completeness and effort were compared with the Friedman test and pairwise Wilcoxon signed-rank tests. Within each system, identification was compared across strata and plan types with chi-square or Fisher's exact tests. P values were Holm-adjusted within each family of pairwise tests. All tests were two-sided at α = 0.05. Analyses used Python 3.10 and SciPy.</w:t>
       </w:r>
     </w:p>
     <w:p>
@@ -171,51 +157,73 @@
       </w:r>
     </w:p>
     <w:p>
+      <w:pPr>
+        <w:pStyle w:val="Heading3"/>
+      </w:pPr>
       <w:r>
-        <w:rPr>
-          <w:i w:val="0"/>
-        </w:rPr>
-        <w:t>Policy identification. OrthoAppeals cited the governing policy in 167 of 167 (100%; 95% CI 98–100%) cases, ChatGPT in 106 of 167 (63%; 95% CI 56–70%), Claude in 140 of 167 (84%; 95% CI 77–89%) and Gemini in 138 of 167 (83%; 95% CI 76–88%) (Cochran's Q = 81.5, P &lt; 0.001; Table 1, Fig. 2a). OrthoAppeals was correct where the chatbot was not in 61 cases against ChatGPT, 27 against Claude and 29 against Gemini, with no discordant pair in the other direction (each P &lt; 0.001; Table 2). Claude and Gemini did not differ (P = 0.86); both exceeded ChatGPT (P &lt; 0.001 and P &lt; 0.001).</w:t>
+        <w:t>Policy identification</w:t>
       </w:r>
     </w:p>
     <w:p>
       <w:r>
-        <w:rPr>
-          <w:i w:val="0"/>
-        </w:rPr>
-        <w:t>By stratum, systems differed where criteria were published (stratum A, Q = 121.4, P &lt; 0.001) and where no policy existed (stratum C, Q = 39.4, P &lt; 0.001) but not where criteria were vendor-held (stratum B, Q = 2.0, P = 0.57). In stratum A, ChatGPT found the policy in 61 of 120 (51%) cases, returning no document in 42; Claude found it in 102 of 120 (85%) and Gemini in 110 of 120 (92%). In stratum C, ChatGPT correctly reported no policy in 34 of 35 (97%) cases and Claude in 27 of 35 (77%), whereas Gemini did so in 16 of 35 (46%) and cited a nonexistent governing document in 19 of 35 (54%) (Q = 39.8, P &lt; 0.001; versus OrthoAppeals P &lt; 0.001, versus Claude P = 0.007, versus ChatGPT P &lt; 0.001). Within systems, identification varied by stratum for ChatGPT (P &lt; 0.001) and Gemini (P &lt; 0.001) but not Claude (P = 0.81), and by plan type for ChatGPT (P = 0.004) and Gemini (P &lt; 0.001) but not Claude (P = 1.00; Table 5).</w:t>
+        <w:t>OrthoAppeals cited the governing policy in 167 of 167 (100%, 95% CI 98–100%) cases, ChatGPT in 106 of 167 (63%, 95% CI 56–70%), Claude in 140 of 167 (84%, 95% CI 77–89%) and Gemini in 138 of 167 (83%, 95% CI 76–88%) (Cochran's Q = 81.5, P &lt; 0.001, Fig. 2a). OrthoAppeals was correct where the chatbot was not in 61 cases against ChatGPT, 27 against Claude and 29 against Gemini, with no discordant pair in the other direction (each P &lt; 0.001, Table 1). Claude and Gemini did not differ (P = 0.86). Both exceeded ChatGPT (P &lt; 0.001 and P &lt; 0.001).</w:t>
       </w:r>
     </w:p>
     <w:p>
       <w:r>
-        <w:rPr>
-          <w:i w:val="0"/>
-        </w:rPr>
-        <w:t>Appeal letters. In stratum A, the letter quoted a criterion answering the denial reason in 119 of 120 (99%) OrthoAppeals cases, 109 of 120 (91%) Gemini, 80 of 120 (67%) Claude and 30 of 120 (25%) ChatGPT (Q = 176.0, P &lt; 0.001; Table 3, Fig. 2b); every pairwise difference was significant (all Holm-adjusted P ≤ 0.002; Table 4). A quotation found in neither the governing document nor the cited document appeared in 55 of 120 (46%) Claude letters, 51 of 120 (42%) Gemini, 9 of 120 (8%) ChatGPT and 0 OrthoAppeals (95% CI 0–3%; Q = 107.9, P &lt; 0.001). Claude and Gemini did not differ (P = 0.66); each exceeded ChatGPT (P &lt; 0.001 and P &lt; 0.001) and OrthoAppeals (both P &lt; 0.001). An invented policy number or effective date appeared in 34 of 167 (20%) Gemini, 32 of 167 (19%) Claude, 8 of 167 (5%) ChatGPT and 0 OrthoAppeals letters (Q = 61.8, P &lt; 0.001).</w:t>
+        <w:t>Systems differed where criteria were published (stratum A, Q = 121.4, P &lt; 0.001) and where no policy existed (stratum C, Q = 39.4, P &lt; 0.001) but not where criteria were vendor-held (stratum B, Q = 2.0, P = 0.57). In stratum A, ChatGPT found the policy in 61 of 120 (51%) cases, returning no document in 42. Claude found it in 102 of 120 (85%) and Gemini in 110 of 120 (92%). In stratum C, ChatGPT correctly reported that no policy existed in 34 of 35 (97%) cases and Claude in 27 of 35 (77%), whereas Gemini did so in 16 of 35 (46%) and hallucinated a governing policy in 19 of 35 (54%) (Q = 39.8, P &lt; 0.001, versus OrthoAppeals P &lt; 0.001, versus Claude P = 0.007, versus ChatGPT P &lt; 0.001). Within systems, identification varied by stratum for ChatGPT (P &lt; 0.001) and Gemini (P &lt; 0.001) but not Claude (P = 0.81), and by plan type for ChatGPT (P = 0.004) and Gemini (P &lt; 0.001) but not Claude (P = 1.00, Table 3).</w:t>
+      </w:r>
+    </w:p>
+    <w:p>
+      <w:pPr>
+        <w:pStyle w:val="Heading3"/>
+      </w:pPr>
+      <w:r>
+        <w:t>Accuracy of the appeal letter</w:t>
       </w:r>
     </w:p>
     <w:p>
       <w:r>
-        <w:rPr>
-          <w:i w:val="0"/>
-        </w:rPr>
-        <w:t>OrthoAppeals stated the filing deadline in 167 of 167 (100%) letters, Claude in 159 of 167 (95%), ChatGPT in 76 of 167 (46%) and Gemini in 23 of 167 (14%) (Q = 313.0, P &lt; 0.001; Fig. 2c). The appeal route was stated in 165 of 167 (99%), 166 of 167 (99%), 113 of 167 (68%) and 154 of 167 (92%) letters respectively (Q = 114.2, P &lt; 0.001). ChatGPT's letter was not sendable in 15 of 167 cases; the other systems' letters were sendable in every case (Q = 45.0, P &lt; 0.001). In stratum C, OrthoAppeals, ChatGPT and Claude asked the plan for its criteria in every letter and Gemini in 2 of 35 (6%) (Q = 99.0, P &lt; 0.001).</w:t>
+        <w:t>In stratum A, the letter quoted a criterion answering the denial reason in 119 of 120 (99%) OrthoAppeals cases, 109 of 120 (91%) Gemini, 80 of 120 (67%) Claude and 30 of 120 (25%) ChatGPT (Q = 176.0, P &lt; 0.001, Fig. 2b). Every pairwise difference was significant (all Holm-adjusted P ≤ 0.002, Table 2). Hallucinated quotations, text attributed to the policy that appeared in neither the governing document nor the document the system itself cited, appeared in 55 of 120 (46%) Claude letters, 51 of 120 (42%) Gemini, 9 of 120 (8%) ChatGPT and 0 OrthoAppeals (95% CI 0–3%, Q = 107.9, P &lt; 0.001). Claude and Gemini did not differ (P = 0.66). Each exceeded ChatGPT (P &lt; 0.001 and P &lt; 0.001) and OrthoAppeals (both P &lt; 0.001). A hallucinated policy number or effective date appeared in 34 of 167 (20%) Gemini, 32 of 167 (19%) Claude, 8 of 167 (5%) ChatGPT and 0 OrthoAppeals letters (Q = 61.8, P &lt; 0.001).</w:t>
+      </w:r>
+    </w:p>
+    <w:p>
+      <w:pPr>
+        <w:pStyle w:val="Heading3"/>
+      </w:pPr>
+      <w:r>
+        <w:t>Deadline, appeal route and readiness to send</w:t>
       </w:r>
     </w:p>
     <w:p>
       <w:r>
-        <w:rPr>
-          <w:i w:val="0"/>
-        </w:rPr>
-        <w:t>Completeness and effort. Judged completeness (0–4) averaged 3.99 for OrthoAppeals, 3.38 for Claude, 3.00 for ChatGPT and 2.91 for Gemini (Friedman χ² = 203.1, P &lt; 0.001). OrthoAppeals exceeded each chatbot (all P &lt; 0.001), Claude exceeded ChatGPT (P &lt; 0.001) and Gemini (P &lt; 0.001), and ChatGPT and Gemini did not differ (P = 0.40; Table 5). The chatbots made a median of 12 (IQR 9–16) web searches per case for ChatGPT, 17 (8–28) for Claude and 46 (28–77) for Gemini (Friedman P &lt; 0.001; all pairwise P &lt; 0.001), and 5, 8 and 4 page fetches (Friedman P &lt; 0.001; Fig. 2d). OrthoAppeals performed no search.</w:t>
+        <w:t>OrthoAppeals stated the filing deadline in 167 of 167 (100%) letters, Claude in 159 of 167 (95%), ChatGPT in 76 of 167 (46%) and Gemini in 23 of 167 (14%) (Q = 313.0, P &lt; 0.001, Fig. 2c). Where to send the appeal was stated in 165 of 167 (99%), 166 of 167 (99%), 113 of 167 (68%) and 154 of 167 (92%) letters respectively (Q = 114.2, P &lt; 0.001). ChatGPT's letter was not ready to send in 15 of 167 cases. The other systems' letters were ready in every case (Q = 45.0, P &lt; 0.001). Where no policy existed, OrthoAppeals, ChatGPT and Claude asked the plan for its criteria in every letter and Gemini in 2 of 35 (6%) (Q = 99.0, P &lt; 0.001).</w:t>
+      </w:r>
+    </w:p>
+    <w:p>
+      <w:pPr>
+        <w:pStyle w:val="Heading3"/>
+      </w:pPr>
+      <w:r>
+        <w:t>Completeness and effort</w:t>
       </w:r>
     </w:p>
     <w:p>
       <w:r>
-        <w:rPr>
-          <w:i w:val="0"/>
-        </w:rPr>
-        <w:t>OrthoAppeals' automated check flagged 45 of 167 (27%) first drafts for a rule, number or quotation attributed to the plan that was not in the policy excerpts; 43 were revised, and 0 delivered letters contained such a statement.</w:t>
+        <w:t>Completeness (0 to 4) averaged 3.99 for OrthoAppeals, 3.38 for Claude, 3.00 for ChatGPT and 2.91 for Gemini (Friedman χ² = 203.1, P &lt; 0.001). OrthoAppeals exceeded each chatbot (all P &lt; 0.001), Claude exceeded ChatGPT (P &lt; 0.001) and Gemini (P &lt; 0.001), and ChatGPT and Gemini did not differ (P = 0.40, Table 3). The chatbots made a median of 12 (IQR 9–16) web searches per case for ChatGPT, 17 (8–28) for Claude and 46 (28–77) for Gemini (Friedman P &lt; 0.001, all pairwise P &lt; 0.001), and 5, 8 and 4 page visits (Friedman P &lt; 0.001, Fig. 2d). OrthoAppeals performed no search.</w:t>
+      </w:r>
+    </w:p>
+    <w:p>
+      <w:pPr>
+        <w:pStyle w:val="Heading3"/>
+      </w:pPr>
+      <w:r>
+        <w:t>Automated correction in OrthoAppeals</w:t>
+      </w:r>
+    </w:p>
+    <w:p>
+      <w:r>
+        <w:t>OrthoAppeals' checks flagged 45 of 167 (27%) first drafts for a rule, number or quotation attributed to the plan that was not in the policy criteria. Of these, 43 were revised, and no delivered letter contained such a statement.</w:t>
       </w:r>
     </w:p>
     <w:p>
@@ -230,470 +238,8 @@
       <w:r>
         <w:rPr>
           <w:b/>
-          <w:i w:val="0"/>
         </w:rPr>
-        <w:t>Table 1. Correct identification of the governing policy, by stratum: n (%; Wilson 95% CI)</w:t>
-      </w:r>
-    </w:p>
-    <w:tbl>
-      <w:tblPr>
-        <w:tblStyle w:val="TableGrid"/>
-        <w:tblW w:type="auto" w:w="0"/>
-        <w:tblLook w:firstColumn="1" w:firstRow="1" w:lastColumn="0" w:lastRow="0" w:noHBand="0" w:noVBand="1" w:val="04A0"/>
-      </w:tblPr>
-      <w:tblGrid>
-        <w:gridCol w:w="1728"/>
-        <w:gridCol w:w="1728"/>
-        <w:gridCol w:w="1728"/>
-        <w:gridCol w:w="1728"/>
-        <w:gridCol w:w="1728"/>
-      </w:tblGrid>
-      <w:tr>
-        <w:tc>
-          <w:tcPr>
-            <w:tcW w:type="dxa" w:w="1728"/>
-          </w:tcPr>
-          <w:p>
-            <w:r/>
-            <w:r>
-              <w:rPr>
-                <w:b/>
-                <w:sz w:val="18"/>
-              </w:rPr>
-              <w:t>System</w:t>
-            </w:r>
-          </w:p>
-        </w:tc>
-        <w:tc>
-          <w:tcPr>
-            <w:tcW w:type="dxa" w:w="1728"/>
-          </w:tcPr>
-          <w:p>
-            <w:r/>
-            <w:r>
-              <w:rPr>
-                <w:b/>
-                <w:sz w:val="18"/>
-              </w:rPr>
-              <w:t>Stratum A (n = 120)</w:t>
-            </w:r>
-          </w:p>
-        </w:tc>
-        <w:tc>
-          <w:tcPr>
-            <w:tcW w:type="dxa" w:w="1728"/>
-          </w:tcPr>
-          <w:p>
-            <w:r/>
-            <w:r>
-              <w:rPr>
-                <w:b/>
-                <w:sz w:val="18"/>
-              </w:rPr>
-              <w:t>Stratum B (n = 12)</w:t>
-            </w:r>
-          </w:p>
-        </w:tc>
-        <w:tc>
-          <w:tcPr>
-            <w:tcW w:type="dxa" w:w="1728"/>
-          </w:tcPr>
-          <w:p>
-            <w:r/>
-            <w:r>
-              <w:rPr>
-                <w:b/>
-                <w:sz w:val="18"/>
-              </w:rPr>
-              <w:t>Stratum C (n = 35)</w:t>
-            </w:r>
-          </w:p>
-        </w:tc>
-        <w:tc>
-          <w:tcPr>
-            <w:tcW w:type="dxa" w:w="1728"/>
-          </w:tcPr>
-          <w:p>
-            <w:r/>
-            <w:r>
-              <w:rPr>
-                <w:b/>
-                <w:sz w:val="18"/>
-              </w:rPr>
-              <w:t>All (n = 167)</w:t>
-            </w:r>
-          </w:p>
-        </w:tc>
-      </w:tr>
-      <w:tr>
-        <w:tc>
-          <w:tcPr>
-            <w:tcW w:type="dxa" w:w="1728"/>
-          </w:tcPr>
-          <w:p>
-            <w:r/>
-            <w:r>
-              <w:rPr>
-                <w:sz w:val="18"/>
-              </w:rPr>
-              <w:t>OrthoAppeals</w:t>
-            </w:r>
-          </w:p>
-        </w:tc>
-        <w:tc>
-          <w:tcPr>
-            <w:tcW w:type="dxa" w:w="1728"/>
-          </w:tcPr>
-          <w:p>
-            <w:r/>
-            <w:r>
-              <w:rPr>
-                <w:sz w:val="18"/>
-              </w:rPr>
-              <w:t>120 (100%; 97–100%)</w:t>
-            </w:r>
-          </w:p>
-        </w:tc>
-        <w:tc>
-          <w:tcPr>
-            <w:tcW w:type="dxa" w:w="1728"/>
-          </w:tcPr>
-          <w:p>
-            <w:r/>
-            <w:r>
-              <w:rPr>
-                <w:sz w:val="18"/>
-              </w:rPr>
-              <w:t>12 (100%; 76–100%)</w:t>
-            </w:r>
-          </w:p>
-        </w:tc>
-        <w:tc>
-          <w:tcPr>
-            <w:tcW w:type="dxa" w:w="1728"/>
-          </w:tcPr>
-          <w:p>
-            <w:r/>
-            <w:r>
-              <w:rPr>
-                <w:sz w:val="18"/>
-              </w:rPr>
-              <w:t>35 (100%; 90–100%)</w:t>
-            </w:r>
-          </w:p>
-        </w:tc>
-        <w:tc>
-          <w:tcPr>
-            <w:tcW w:type="dxa" w:w="1728"/>
-          </w:tcPr>
-          <w:p>
-            <w:r/>
-            <w:r>
-              <w:rPr>
-                <w:sz w:val="18"/>
-              </w:rPr>
-              <w:t>167 (100%; 98–100%)</w:t>
-            </w:r>
-          </w:p>
-        </w:tc>
-      </w:tr>
-      <w:tr>
-        <w:tc>
-          <w:tcPr>
-            <w:tcW w:type="dxa" w:w="1728"/>
-          </w:tcPr>
-          <w:p>
-            <w:r/>
-            <w:r>
-              <w:rPr>
-                <w:sz w:val="18"/>
-              </w:rPr>
-              <w:t>ChatGPT</w:t>
-            </w:r>
-          </w:p>
-        </w:tc>
-        <w:tc>
-          <w:tcPr>
-            <w:tcW w:type="dxa" w:w="1728"/>
-          </w:tcPr>
-          <w:p>
-            <w:r/>
-            <w:r>
-              <w:rPr>
-                <w:sz w:val="18"/>
-              </w:rPr>
-              <w:t>61 (51%; 42–60%)</w:t>
-            </w:r>
-          </w:p>
-        </w:tc>
-        <w:tc>
-          <w:tcPr>
-            <w:tcW w:type="dxa" w:w="1728"/>
-          </w:tcPr>
-          <w:p>
-            <w:r/>
-            <w:r>
-              <w:rPr>
-                <w:sz w:val="18"/>
-              </w:rPr>
-              <w:t>11 (92%; 65–99%)</w:t>
-            </w:r>
-          </w:p>
-        </w:tc>
-        <w:tc>
-          <w:tcPr>
-            <w:tcW w:type="dxa" w:w="1728"/>
-          </w:tcPr>
-          <w:p>
-            <w:r/>
-            <w:r>
-              <w:rPr>
-                <w:sz w:val="18"/>
-              </w:rPr>
-              <w:t>34 (97%; 85–99%)</w:t>
-            </w:r>
-          </w:p>
-        </w:tc>
-        <w:tc>
-          <w:tcPr>
-            <w:tcW w:type="dxa" w:w="1728"/>
-          </w:tcPr>
-          <w:p>
-            <w:r/>
-            <w:r>
-              <w:rPr>
-                <w:sz w:val="18"/>
-              </w:rPr>
-              <w:t>106 (63%; 56–70%)</w:t>
-            </w:r>
-          </w:p>
-        </w:tc>
-      </w:tr>
-      <w:tr>
-        <w:tc>
-          <w:tcPr>
-            <w:tcW w:type="dxa" w:w="1728"/>
-          </w:tcPr>
-          <w:p>
-            <w:r/>
-            <w:r>
-              <w:rPr>
-                <w:sz w:val="18"/>
-              </w:rPr>
-              <w:t>Claude</w:t>
-            </w:r>
-          </w:p>
-        </w:tc>
-        <w:tc>
-          <w:tcPr>
-            <w:tcW w:type="dxa" w:w="1728"/>
-          </w:tcPr>
-          <w:p>
-            <w:r/>
-            <w:r>
-              <w:rPr>
-                <w:sz w:val="18"/>
-              </w:rPr>
-              <w:t>102 (85%; 78–90%)</w:t>
-            </w:r>
-          </w:p>
-        </w:tc>
-        <w:tc>
-          <w:tcPr>
-            <w:tcW w:type="dxa" w:w="1728"/>
-          </w:tcPr>
-          <w:p>
-            <w:r/>
-            <w:r>
-              <w:rPr>
-                <w:sz w:val="18"/>
-              </w:rPr>
-              <w:t>11 (92%; 65–99%)</w:t>
-            </w:r>
-          </w:p>
-        </w:tc>
-        <w:tc>
-          <w:tcPr>
-            <w:tcW w:type="dxa" w:w="1728"/>
-          </w:tcPr>
-          <w:p>
-            <w:r/>
-            <w:r>
-              <w:rPr>
-                <w:sz w:val="18"/>
-              </w:rPr>
-              <w:t>27 (77%; 61–88%)</w:t>
-            </w:r>
-          </w:p>
-        </w:tc>
-        <w:tc>
-          <w:tcPr>
-            <w:tcW w:type="dxa" w:w="1728"/>
-          </w:tcPr>
-          <w:p>
-            <w:r/>
-            <w:r>
-              <w:rPr>
-                <w:sz w:val="18"/>
-              </w:rPr>
-              <w:t>140 (84%; 77–89%)</w:t>
-            </w:r>
-          </w:p>
-        </w:tc>
-      </w:tr>
-      <w:tr>
-        <w:tc>
-          <w:tcPr>
-            <w:tcW w:type="dxa" w:w="1728"/>
-          </w:tcPr>
-          <w:p>
-            <w:r/>
-            <w:r>
-              <w:rPr>
-                <w:sz w:val="18"/>
-              </w:rPr>
-              <w:t>Gemini</w:t>
-            </w:r>
-          </w:p>
-        </w:tc>
-        <w:tc>
-          <w:tcPr>
-            <w:tcW w:type="dxa" w:w="1728"/>
-          </w:tcPr>
-          <w:p>
-            <w:r/>
-            <w:r>
-              <w:rPr>
-                <w:sz w:val="18"/>
-              </w:rPr>
-              <w:t>110 (92%; 85–95%)</w:t>
-            </w:r>
-          </w:p>
-        </w:tc>
-        <w:tc>
-          <w:tcPr>
-            <w:tcW w:type="dxa" w:w="1728"/>
-          </w:tcPr>
-          <w:p>
-            <w:r/>
-            <w:r>
-              <w:rPr>
-                <w:sz w:val="18"/>
-              </w:rPr>
-              <w:t>12 (100%; 76–100%)</w:t>
-            </w:r>
-          </w:p>
-        </w:tc>
-        <w:tc>
-          <w:tcPr>
-            <w:tcW w:type="dxa" w:w="1728"/>
-          </w:tcPr>
-          <w:p>
-            <w:r/>
-            <w:r>
-              <w:rPr>
-                <w:sz w:val="18"/>
-              </w:rPr>
-              <w:t>16 (46%; 30–62%)</w:t>
-            </w:r>
-          </w:p>
-        </w:tc>
-        <w:tc>
-          <w:tcPr>
-            <w:tcW w:type="dxa" w:w="1728"/>
-          </w:tcPr>
-          <w:p>
-            <w:r/>
-            <w:r>
-              <w:rPr>
-                <w:sz w:val="18"/>
-              </w:rPr>
-              <w:t>138 (83%; 76–88%)</w:t>
-            </w:r>
-          </w:p>
-        </w:tc>
-      </w:tr>
-      <w:tr>
-        <w:tc>
-          <w:tcPr>
-            <w:tcW w:type="dxa" w:w="1728"/>
-          </w:tcPr>
-          <w:p>
-            <w:r/>
-            <w:r>
-              <w:rPr>
-                <w:sz w:val="18"/>
-              </w:rPr>
-              <w:t>Cochran's Q (df = 3)</w:t>
-            </w:r>
-          </w:p>
-        </w:tc>
-        <w:tc>
-          <w:tcPr>
-            <w:tcW w:type="dxa" w:w="1728"/>
-          </w:tcPr>
-          <w:p>
-            <w:r/>
-            <w:r>
-              <w:rPr>
-                <w:sz w:val="18"/>
-              </w:rPr>
-              <w:t>121.4; P &lt; 0.001</w:t>
-            </w:r>
-          </w:p>
-        </w:tc>
-        <w:tc>
-          <w:tcPr>
-            <w:tcW w:type="dxa" w:w="1728"/>
-          </w:tcPr>
-          <w:p>
-            <w:r/>
-            <w:r>
-              <w:rPr>
-                <w:sz w:val="18"/>
-              </w:rPr>
-              <w:t>2.0; P = 0.57</w:t>
-            </w:r>
-          </w:p>
-        </w:tc>
-        <w:tc>
-          <w:tcPr>
-            <w:tcW w:type="dxa" w:w="1728"/>
-          </w:tcPr>
-          <w:p>
-            <w:r/>
-            <w:r>
-              <w:rPr>
-                <w:sz w:val="18"/>
-              </w:rPr>
-              <w:t>39.4; P &lt; 0.001</w:t>
-            </w:r>
-          </w:p>
-        </w:tc>
-        <w:tc>
-          <w:tcPr>
-            <w:tcW w:type="dxa" w:w="1728"/>
-          </w:tcPr>
-          <w:p>
-            <w:r/>
-            <w:r>
-              <w:rPr>
-                <w:sz w:val="18"/>
-              </w:rPr>
-              <w:t>81.5; P &lt; 0.001</w:t>
-            </w:r>
-          </w:p>
-        </w:tc>
-      </w:tr>
-    </w:tbl>
-    <w:p/>
-    <w:p>
-      <w:r>
-        <w:rPr>
-          <w:b/>
-          <w:i w:val="0"/>
-        </w:rPr>
-        <w:t>Table 2. Pairwise comparisons of policy identification (exact McNemar test on discordant pairs)</w:t>
+        <w:t>Table 1. Pairwise comparisons of policy identification (exact McNemar test on discordant pairs)</w:t>
       </w:r>
     </w:p>
     <w:tbl>
@@ -781,7 +327,7 @@
               <w:rPr>
                 <w:sz w:val="18"/>
               </w:rPr>
-              <w:t>All cases (n = 167)</w:t>
+              <w:t>All cases (n = 167), Cochran's Q = 81.5, P &lt; 0.001</w:t>
             </w:r>
           </w:p>
         </w:tc>
@@ -1184,7 +730,7 @@
               <w:rPr>
                 <w:sz w:val="18"/>
               </w:rPr>
-              <w:t>Stratum A (n = 120)</w:t>
+              <w:t>Stratum A (n = 120), Cochran's Q = 121.4, P &lt; 0.001</w:t>
             </w:r>
           </w:p>
         </w:tc>
@@ -1587,7 +1133,7 @@
               <w:rPr>
                 <w:sz w:val="18"/>
               </w:rPr>
-              <w:t>Stratum B (n = 12)</w:t>
+              <w:t>Stratum B (n = 12), Cochran's Q = 2.0, P = 0.57</w:t>
             </w:r>
           </w:p>
         </w:tc>
@@ -1990,7 +1536,7 @@
               <w:rPr>
                 <w:sz w:val="18"/>
               </w:rPr>
-              <w:t>Stratum C (n = 35)</w:t>
+              <w:t>Stratum C (n = 35), Cochran's Q = 39.4, P &lt; 0.001</w:t>
             </w:r>
           </w:p>
         </w:tc>
@@ -2386,10 +1932,9 @@
     <w:p>
       <w:r>
         <w:rPr>
-          <w:i w:val="0"/>
           <w:sz w:val="18"/>
         </w:rPr>
-        <w:t>First only / second only: cases the first system had correct and the second wrong, and the reverse. Difference is first minus second, with bootstrap 95% CI. P values Holm-adjusted within each stratum.</w:t>
+        <w:t>First only / second only are the cases the first system had correct and the second wrong, and the reverse. Difference is first minus second with bootstrap 95% CI. P values are Holm-adjusted within each stratum. Proportions by system and stratum are shown in Figure 2a.</w:t>
       </w:r>
     </w:p>
     <w:p/>
@@ -2397,1244 +1942,8 @@
       <w:r>
         <w:rPr>
           <w:b/>
-          <w:i w:val="0"/>
         </w:rPr>
-        <w:t>Table 3. Appeal-letter outcomes: n (%) and omnibus test across the four systems</w:t>
-      </w:r>
-    </w:p>
-    <w:tbl>
-      <w:tblPr>
-        <w:tblStyle w:val="TableGrid"/>
-        <w:tblW w:type="auto" w:w="0"/>
-        <w:tblLook w:firstColumn="1" w:firstRow="1" w:lastColumn="0" w:lastRow="0" w:noHBand="0" w:noVBand="1" w:val="04A0"/>
-      </w:tblPr>
-      <w:tblGrid>
-        <w:gridCol w:w="1440"/>
-        <w:gridCol w:w="1440"/>
-        <w:gridCol w:w="1440"/>
-        <w:gridCol w:w="1440"/>
-        <w:gridCol w:w="1440"/>
-        <w:gridCol w:w="1440"/>
-      </w:tblGrid>
-      <w:tr>
-        <w:tc>
-          <w:tcPr>
-            <w:tcW w:type="dxa" w:w="1440"/>
-          </w:tcPr>
-          <w:p>
-            <w:r/>
-            <w:r>
-              <w:rPr>
-                <w:b/>
-                <w:sz w:val="18"/>
-              </w:rPr>
-              <w:t>Letter outcome</w:t>
-            </w:r>
-          </w:p>
-        </w:tc>
-        <w:tc>
-          <w:tcPr>
-            <w:tcW w:type="dxa" w:w="1440"/>
-          </w:tcPr>
-          <w:p>
-            <w:r/>
-            <w:r>
-              <w:rPr>
-                <w:b/>
-                <w:sz w:val="18"/>
-              </w:rPr>
-              <w:t>OrthoAppeals</w:t>
-            </w:r>
-          </w:p>
-        </w:tc>
-        <w:tc>
-          <w:tcPr>
-            <w:tcW w:type="dxa" w:w="1440"/>
-          </w:tcPr>
-          <w:p>
-            <w:r/>
-            <w:r>
-              <w:rPr>
-                <w:b/>
-                <w:sz w:val="18"/>
-              </w:rPr>
-              <w:t>ChatGPT</w:t>
-            </w:r>
-          </w:p>
-        </w:tc>
-        <w:tc>
-          <w:tcPr>
-            <w:tcW w:type="dxa" w:w="1440"/>
-          </w:tcPr>
-          <w:p>
-            <w:r/>
-            <w:r>
-              <w:rPr>
-                <w:b/>
-                <w:sz w:val="18"/>
-              </w:rPr>
-              <w:t>Claude</w:t>
-            </w:r>
-          </w:p>
-        </w:tc>
-        <w:tc>
-          <w:tcPr>
-            <w:tcW w:type="dxa" w:w="1440"/>
-          </w:tcPr>
-          <w:p>
-            <w:r/>
-            <w:r>
-              <w:rPr>
-                <w:b/>
-                <w:sz w:val="18"/>
-              </w:rPr>
-              <w:t>Gemini</w:t>
-            </w:r>
-          </w:p>
-        </w:tc>
-        <w:tc>
-          <w:tcPr>
-            <w:tcW w:type="dxa" w:w="1440"/>
-          </w:tcPr>
-          <w:p>
-            <w:r/>
-            <w:r>
-              <w:rPr>
-                <w:b/>
-                <w:sz w:val="18"/>
-              </w:rPr>
-              <w:t>Cochran's Q; P</w:t>
-            </w:r>
-          </w:p>
-        </w:tc>
-      </w:tr>
-      <w:tr>
-        <w:tc>
-          <w:tcPr>
-            <w:tcW w:type="dxa" w:w="1440"/>
-          </w:tcPr>
-          <w:p>
-            <w:r/>
-            <w:r>
-              <w:rPr>
-                <w:sz w:val="18"/>
-              </w:rPr>
-              <w:t>Quotes a criterion answering the denial reason (stratum A) (n = 120)</w:t>
-            </w:r>
-          </w:p>
-        </w:tc>
-        <w:tc>
-          <w:tcPr>
-            <w:tcW w:type="dxa" w:w="1440"/>
-          </w:tcPr>
-          <w:p>
-            <w:r/>
-            <w:r>
-              <w:rPr>
-                <w:sz w:val="18"/>
-              </w:rPr>
-              <w:t>119 (99%)</w:t>
-            </w:r>
-          </w:p>
-        </w:tc>
-        <w:tc>
-          <w:tcPr>
-            <w:tcW w:type="dxa" w:w="1440"/>
-          </w:tcPr>
-          <w:p>
-            <w:r/>
-            <w:r>
-              <w:rPr>
-                <w:sz w:val="18"/>
-              </w:rPr>
-              <w:t>30 (25%)</w:t>
-            </w:r>
-          </w:p>
-        </w:tc>
-        <w:tc>
-          <w:tcPr>
-            <w:tcW w:type="dxa" w:w="1440"/>
-          </w:tcPr>
-          <w:p>
-            <w:r/>
-            <w:r>
-              <w:rPr>
-                <w:sz w:val="18"/>
-              </w:rPr>
-              <w:t>80 (67%)</w:t>
-            </w:r>
-          </w:p>
-        </w:tc>
-        <w:tc>
-          <w:tcPr>
-            <w:tcW w:type="dxa" w:w="1440"/>
-          </w:tcPr>
-          <w:p>
-            <w:r/>
-            <w:r>
-              <w:rPr>
-                <w:sz w:val="18"/>
-              </w:rPr>
-              <w:t>109 (91%)</w:t>
-            </w:r>
-          </w:p>
-        </w:tc>
-        <w:tc>
-          <w:tcPr>
-            <w:tcW w:type="dxa" w:w="1440"/>
-          </w:tcPr>
-          <w:p>
-            <w:r/>
-            <w:r>
-              <w:rPr>
-                <w:sz w:val="18"/>
-              </w:rPr>
-              <w:t>176.0; P &lt; 0.001</w:t>
-            </w:r>
-          </w:p>
-        </w:tc>
-      </w:tr>
-      <w:tr>
-        <w:tc>
-          <w:tcPr>
-            <w:tcW w:type="dxa" w:w="1440"/>
-          </w:tcPr>
-          <w:p>
-            <w:r/>
-            <w:r>
-              <w:rPr>
-                <w:sz w:val="18"/>
-              </w:rPr>
-              <w:t>Any quotation not found in the policy (stratum A) (n = 120)</w:t>
-            </w:r>
-          </w:p>
-        </w:tc>
-        <w:tc>
-          <w:tcPr>
-            <w:tcW w:type="dxa" w:w="1440"/>
-          </w:tcPr>
-          <w:p>
-            <w:r/>
-            <w:r>
-              <w:rPr>
-                <w:sz w:val="18"/>
-              </w:rPr>
-              <w:t>0 (0%)</w:t>
-            </w:r>
-          </w:p>
-        </w:tc>
-        <w:tc>
-          <w:tcPr>
-            <w:tcW w:type="dxa" w:w="1440"/>
-          </w:tcPr>
-          <w:p>
-            <w:r/>
-            <w:r>
-              <w:rPr>
-                <w:sz w:val="18"/>
-              </w:rPr>
-              <w:t>9 (8%)</w:t>
-            </w:r>
-          </w:p>
-        </w:tc>
-        <w:tc>
-          <w:tcPr>
-            <w:tcW w:type="dxa" w:w="1440"/>
-          </w:tcPr>
-          <w:p>
-            <w:r/>
-            <w:r>
-              <w:rPr>
-                <w:sz w:val="18"/>
-              </w:rPr>
-              <w:t>55 (46%)</w:t>
-            </w:r>
-          </w:p>
-        </w:tc>
-        <w:tc>
-          <w:tcPr>
-            <w:tcW w:type="dxa" w:w="1440"/>
-          </w:tcPr>
-          <w:p>
-            <w:r/>
-            <w:r>
-              <w:rPr>
-                <w:sz w:val="18"/>
-              </w:rPr>
-              <w:t>51 (42%)</w:t>
-            </w:r>
-          </w:p>
-        </w:tc>
-        <w:tc>
-          <w:tcPr>
-            <w:tcW w:type="dxa" w:w="1440"/>
-          </w:tcPr>
-          <w:p>
-            <w:r/>
-            <w:r>
-              <w:rPr>
-                <w:sz w:val="18"/>
-              </w:rPr>
-              <w:t>107.9; P &lt; 0.001</w:t>
-            </w:r>
-          </w:p>
-        </w:tc>
-      </w:tr>
-      <w:tr>
-        <w:tc>
-          <w:tcPr>
-            <w:tcW w:type="dxa" w:w="1440"/>
-          </w:tcPr>
-          <w:p>
-            <w:r/>
-            <w:r>
-              <w:rPr>
-                <w:sz w:val="18"/>
-              </w:rPr>
-              <w:t>Quotes another operation's criteria (stratum A) (n = 120)</w:t>
-            </w:r>
-          </w:p>
-        </w:tc>
-        <w:tc>
-          <w:tcPr>
-            <w:tcW w:type="dxa" w:w="1440"/>
-          </w:tcPr>
-          <w:p>
-            <w:r/>
-            <w:r>
-              <w:rPr>
-                <w:sz w:val="18"/>
-              </w:rPr>
-              <w:t>0 (0%)</w:t>
-            </w:r>
-          </w:p>
-        </w:tc>
-        <w:tc>
-          <w:tcPr>
-            <w:tcW w:type="dxa" w:w="1440"/>
-          </w:tcPr>
-          <w:p>
-            <w:r/>
-            <w:r>
-              <w:rPr>
-                <w:sz w:val="18"/>
-              </w:rPr>
-              <w:t>0 (0%)</w:t>
-            </w:r>
-          </w:p>
-        </w:tc>
-        <w:tc>
-          <w:tcPr>
-            <w:tcW w:type="dxa" w:w="1440"/>
-          </w:tcPr>
-          <w:p>
-            <w:r/>
-            <w:r>
-              <w:rPr>
-                <w:sz w:val="18"/>
-              </w:rPr>
-              <w:t>1 (1%)</w:t>
-            </w:r>
-          </w:p>
-        </w:tc>
-        <w:tc>
-          <w:tcPr>
-            <w:tcW w:type="dxa" w:w="1440"/>
-          </w:tcPr>
-          <w:p>
-            <w:r/>
-            <w:r>
-              <w:rPr>
-                <w:sz w:val="18"/>
-              </w:rPr>
-              <w:t>2 (2%)</w:t>
-            </w:r>
-          </w:p>
-        </w:tc>
-        <w:tc>
-          <w:tcPr>
-            <w:tcW w:type="dxa" w:w="1440"/>
-          </w:tcPr>
-          <w:p>
-            <w:r/>
-            <w:r>
-              <w:rPr>
-                <w:sz w:val="18"/>
-              </w:rPr>
-              <w:t>3.7; P = 0.30</w:t>
-            </w:r>
-          </w:p>
-        </w:tc>
-      </w:tr>
-      <w:tr>
-        <w:tc>
-          <w:tcPr>
-            <w:tcW w:type="dxa" w:w="1440"/>
-          </w:tcPr>
-          <w:p>
-            <w:r/>
-            <w:r>
-              <w:rPr>
-                <w:sz w:val="18"/>
-              </w:rPr>
-              <w:t>Cites the governing policy in the letter (stratum A) (n = 120)</w:t>
-            </w:r>
-          </w:p>
-        </w:tc>
-        <w:tc>
-          <w:tcPr>
-            <w:tcW w:type="dxa" w:w="1440"/>
-          </w:tcPr>
-          <w:p>
-            <w:r/>
-            <w:r>
-              <w:rPr>
-                <w:sz w:val="18"/>
-              </w:rPr>
-              <w:t>120 (100%)</w:t>
-            </w:r>
-          </w:p>
-        </w:tc>
-        <w:tc>
-          <w:tcPr>
-            <w:tcW w:type="dxa" w:w="1440"/>
-          </w:tcPr>
-          <w:p>
-            <w:r/>
-            <w:r>
-              <w:rPr>
-                <w:sz w:val="18"/>
-              </w:rPr>
-              <w:t>70 (58%)</w:t>
-            </w:r>
-          </w:p>
-        </w:tc>
-        <w:tc>
-          <w:tcPr>
-            <w:tcW w:type="dxa" w:w="1440"/>
-          </w:tcPr>
-          <w:p>
-            <w:r/>
-            <w:r>
-              <w:rPr>
-                <w:sz w:val="18"/>
-              </w:rPr>
-              <w:t>111 (92%)</w:t>
-            </w:r>
-          </w:p>
-        </w:tc>
-        <w:tc>
-          <w:tcPr>
-            <w:tcW w:type="dxa" w:w="1440"/>
-          </w:tcPr>
-          <w:p>
-            <w:r/>
-            <w:r>
-              <w:rPr>
-                <w:sz w:val="18"/>
-              </w:rPr>
-              <w:t>117 (98%)</w:t>
-            </w:r>
-          </w:p>
-        </w:tc>
-        <w:tc>
-          <w:tcPr>
-            <w:tcW w:type="dxa" w:w="1440"/>
-          </w:tcPr>
-          <w:p>
-            <w:r/>
-            <w:r>
-              <w:rPr>
-                <w:sz w:val="18"/>
-              </w:rPr>
-              <w:t>123.7; P &lt; 0.001</w:t>
-            </w:r>
-          </w:p>
-        </w:tc>
-      </w:tr>
-      <w:tr>
-        <w:tc>
-          <w:tcPr>
-            <w:tcW w:type="dxa" w:w="1440"/>
-          </w:tcPr>
-          <w:p>
-            <w:r/>
-            <w:r>
-              <w:rPr>
-                <w:sz w:val="18"/>
-              </w:rPr>
-              <w:t>Invented policy number or effective date (n = 167)</w:t>
-            </w:r>
-          </w:p>
-        </w:tc>
-        <w:tc>
-          <w:tcPr>
-            <w:tcW w:type="dxa" w:w="1440"/>
-          </w:tcPr>
-          <w:p>
-            <w:r/>
-            <w:r>
-              <w:rPr>
-                <w:sz w:val="18"/>
-              </w:rPr>
-              <w:t>0 (0%)</w:t>
-            </w:r>
-          </w:p>
-        </w:tc>
-        <w:tc>
-          <w:tcPr>
-            <w:tcW w:type="dxa" w:w="1440"/>
-          </w:tcPr>
-          <w:p>
-            <w:r/>
-            <w:r>
-              <w:rPr>
-                <w:sz w:val="18"/>
-              </w:rPr>
-              <w:t>8 (5%)</w:t>
-            </w:r>
-          </w:p>
-        </w:tc>
-        <w:tc>
-          <w:tcPr>
-            <w:tcW w:type="dxa" w:w="1440"/>
-          </w:tcPr>
-          <w:p>
-            <w:r/>
-            <w:r>
-              <w:rPr>
-                <w:sz w:val="18"/>
-              </w:rPr>
-              <w:t>32 (19%)</w:t>
-            </w:r>
-          </w:p>
-        </w:tc>
-        <w:tc>
-          <w:tcPr>
-            <w:tcW w:type="dxa" w:w="1440"/>
-          </w:tcPr>
-          <w:p>
-            <w:r/>
-            <w:r>
-              <w:rPr>
-                <w:sz w:val="18"/>
-              </w:rPr>
-              <w:t>34 (20%)</w:t>
-            </w:r>
-          </w:p>
-        </w:tc>
-        <w:tc>
-          <w:tcPr>
-            <w:tcW w:type="dxa" w:w="1440"/>
-          </w:tcPr>
-          <w:p>
-            <w:r/>
-            <w:r>
-              <w:rPr>
-                <w:sz w:val="18"/>
-              </w:rPr>
-              <w:t>61.8; P &lt; 0.001</w:t>
-            </w:r>
-          </w:p>
-        </w:tc>
-      </w:tr>
-      <w:tr>
-        <w:tc>
-          <w:tcPr>
-            <w:tcW w:type="dxa" w:w="1440"/>
-          </w:tcPr>
-          <w:p>
-            <w:r/>
-            <w:r>
-              <w:rPr>
-                <w:sz w:val="18"/>
-              </w:rPr>
-              <w:t>States the filing deadline (n = 167)</w:t>
-            </w:r>
-          </w:p>
-        </w:tc>
-        <w:tc>
-          <w:tcPr>
-            <w:tcW w:type="dxa" w:w="1440"/>
-          </w:tcPr>
-          <w:p>
-            <w:r/>
-            <w:r>
-              <w:rPr>
-                <w:sz w:val="18"/>
-              </w:rPr>
-              <w:t>167 (100%)</w:t>
-            </w:r>
-          </w:p>
-        </w:tc>
-        <w:tc>
-          <w:tcPr>
-            <w:tcW w:type="dxa" w:w="1440"/>
-          </w:tcPr>
-          <w:p>
-            <w:r/>
-            <w:r>
-              <w:rPr>
-                <w:sz w:val="18"/>
-              </w:rPr>
-              <w:t>76 (46%)</w:t>
-            </w:r>
-          </w:p>
-        </w:tc>
-        <w:tc>
-          <w:tcPr>
-            <w:tcW w:type="dxa" w:w="1440"/>
-          </w:tcPr>
-          <w:p>
-            <w:r/>
-            <w:r>
-              <w:rPr>
-                <w:sz w:val="18"/>
-              </w:rPr>
-              <w:t>159 (95%)</w:t>
-            </w:r>
-          </w:p>
-        </w:tc>
-        <w:tc>
-          <w:tcPr>
-            <w:tcW w:type="dxa" w:w="1440"/>
-          </w:tcPr>
-          <w:p>
-            <w:r/>
-            <w:r>
-              <w:rPr>
-                <w:sz w:val="18"/>
-              </w:rPr>
-              <w:t>23 (14%)</w:t>
-            </w:r>
-          </w:p>
-        </w:tc>
-        <w:tc>
-          <w:tcPr>
-            <w:tcW w:type="dxa" w:w="1440"/>
-          </w:tcPr>
-          <w:p>
-            <w:r/>
-            <w:r>
-              <w:rPr>
-                <w:sz w:val="18"/>
-              </w:rPr>
-              <w:t>313.0; P &lt; 0.001</w:t>
-            </w:r>
-          </w:p>
-        </w:tc>
-      </w:tr>
-      <w:tr>
-        <w:tc>
-          <w:tcPr>
-            <w:tcW w:type="dxa" w:w="1440"/>
-          </w:tcPr>
-          <w:p>
-            <w:r/>
-            <w:r>
-              <w:rPr>
-                <w:sz w:val="18"/>
-              </w:rPr>
-              <w:t>States the appeal route (n = 167)</w:t>
-            </w:r>
-          </w:p>
-        </w:tc>
-        <w:tc>
-          <w:tcPr>
-            <w:tcW w:type="dxa" w:w="1440"/>
-          </w:tcPr>
-          <w:p>
-            <w:r/>
-            <w:r>
-              <w:rPr>
-                <w:sz w:val="18"/>
-              </w:rPr>
-              <w:t>165 (99%)</w:t>
-            </w:r>
-          </w:p>
-        </w:tc>
-        <w:tc>
-          <w:tcPr>
-            <w:tcW w:type="dxa" w:w="1440"/>
-          </w:tcPr>
-          <w:p>
-            <w:r/>
-            <w:r>
-              <w:rPr>
-                <w:sz w:val="18"/>
-              </w:rPr>
-              <w:t>113 (68%)</w:t>
-            </w:r>
-          </w:p>
-        </w:tc>
-        <w:tc>
-          <w:tcPr>
-            <w:tcW w:type="dxa" w:w="1440"/>
-          </w:tcPr>
-          <w:p>
-            <w:r/>
-            <w:r>
-              <w:rPr>
-                <w:sz w:val="18"/>
-              </w:rPr>
-              <w:t>166 (99%)</w:t>
-            </w:r>
-          </w:p>
-        </w:tc>
-        <w:tc>
-          <w:tcPr>
-            <w:tcW w:type="dxa" w:w="1440"/>
-          </w:tcPr>
-          <w:p>
-            <w:r/>
-            <w:r>
-              <w:rPr>
-                <w:sz w:val="18"/>
-              </w:rPr>
-              <w:t>154 (92%)</w:t>
-            </w:r>
-          </w:p>
-        </w:tc>
-        <w:tc>
-          <w:tcPr>
-            <w:tcW w:type="dxa" w:w="1440"/>
-          </w:tcPr>
-          <w:p>
-            <w:r/>
-            <w:r>
-              <w:rPr>
-                <w:sz w:val="18"/>
-              </w:rPr>
-              <w:t>114.2; P &lt; 0.001</w:t>
-            </w:r>
-          </w:p>
-        </w:tc>
-      </w:tr>
-      <w:tr>
-        <w:tc>
-          <w:tcPr>
-            <w:tcW w:type="dxa" w:w="1440"/>
-          </w:tcPr>
-          <w:p>
-            <w:r/>
-            <w:r>
-              <w:rPr>
-                <w:sz w:val="18"/>
-              </w:rPr>
-              <w:t>Sendable: identifiers present, no placeholders (n = 167)</w:t>
-            </w:r>
-          </w:p>
-        </w:tc>
-        <w:tc>
-          <w:tcPr>
-            <w:tcW w:type="dxa" w:w="1440"/>
-          </w:tcPr>
-          <w:p>
-            <w:r/>
-            <w:r>
-              <w:rPr>
-                <w:sz w:val="18"/>
-              </w:rPr>
-              <w:t>167 (100%)</w:t>
-            </w:r>
-          </w:p>
-        </w:tc>
-        <w:tc>
-          <w:tcPr>
-            <w:tcW w:type="dxa" w:w="1440"/>
-          </w:tcPr>
-          <w:p>
-            <w:r/>
-            <w:r>
-              <w:rPr>
-                <w:sz w:val="18"/>
-              </w:rPr>
-              <w:t>152 (91%)</w:t>
-            </w:r>
-          </w:p>
-        </w:tc>
-        <w:tc>
-          <w:tcPr>
-            <w:tcW w:type="dxa" w:w="1440"/>
-          </w:tcPr>
-          <w:p>
-            <w:r/>
-            <w:r>
-              <w:rPr>
-                <w:sz w:val="18"/>
-              </w:rPr>
-              <w:t>167 (100%)</w:t>
-            </w:r>
-          </w:p>
-        </w:tc>
-        <w:tc>
-          <w:tcPr>
-            <w:tcW w:type="dxa" w:w="1440"/>
-          </w:tcPr>
-          <w:p>
-            <w:r/>
-            <w:r>
-              <w:rPr>
-                <w:sz w:val="18"/>
-              </w:rPr>
-              <w:t>167 (100%)</w:t>
-            </w:r>
-          </w:p>
-        </w:tc>
-        <w:tc>
-          <w:tcPr>
-            <w:tcW w:type="dxa" w:w="1440"/>
-          </w:tcPr>
-          <w:p>
-            <w:r/>
-            <w:r>
-              <w:rPr>
-                <w:sz w:val="18"/>
-              </w:rPr>
-              <w:t>45.0; P &lt; 0.001</w:t>
-            </w:r>
-          </w:p>
-        </w:tc>
-      </w:tr>
-      <w:tr>
-        <w:tc>
-          <w:tcPr>
-            <w:tcW w:type="dxa" w:w="1440"/>
-          </w:tcPr>
-          <w:p>
-            <w:r/>
-            <w:r>
-              <w:rPr>
-                <w:sz w:val="18"/>
-              </w:rPr>
-              <w:t>Letter cut off before its end (n = 167)</w:t>
-            </w:r>
-          </w:p>
-        </w:tc>
-        <w:tc>
-          <w:tcPr>
-            <w:tcW w:type="dxa" w:w="1440"/>
-          </w:tcPr>
-          <w:p>
-            <w:r/>
-            <w:r>
-              <w:rPr>
-                <w:sz w:val="18"/>
-              </w:rPr>
-              <w:t>0 (0%)</w:t>
-            </w:r>
-          </w:p>
-        </w:tc>
-        <w:tc>
-          <w:tcPr>
-            <w:tcW w:type="dxa" w:w="1440"/>
-          </w:tcPr>
-          <w:p>
-            <w:r/>
-            <w:r>
-              <w:rPr>
-                <w:sz w:val="18"/>
-              </w:rPr>
-              <w:t>0 (0%)</w:t>
-            </w:r>
-          </w:p>
-        </w:tc>
-        <w:tc>
-          <w:tcPr>
-            <w:tcW w:type="dxa" w:w="1440"/>
-          </w:tcPr>
-          <w:p>
-            <w:r/>
-            <w:r>
-              <w:rPr>
-                <w:sz w:val="18"/>
-              </w:rPr>
-              <w:t>0 (0%)</w:t>
-            </w:r>
-          </w:p>
-        </w:tc>
-        <w:tc>
-          <w:tcPr>
-            <w:tcW w:type="dxa" w:w="1440"/>
-          </w:tcPr>
-          <w:p>
-            <w:r/>
-            <w:r>
-              <w:rPr>
-                <w:sz w:val="18"/>
-              </w:rPr>
-              <w:t>1 (1%)</w:t>
-            </w:r>
-          </w:p>
-        </w:tc>
-        <w:tc>
-          <w:tcPr>
-            <w:tcW w:type="dxa" w:w="1440"/>
-          </w:tcPr>
-          <w:p>
-            <w:r/>
-            <w:r>
-              <w:rPr>
-                <w:sz w:val="18"/>
-              </w:rPr>
-              <w:t>3.0; P = 0.39</w:t>
-            </w:r>
-          </w:p>
-        </w:tc>
-      </w:tr>
-      <w:tr>
-        <w:tc>
-          <w:tcPr>
-            <w:tcW w:type="dxa" w:w="1440"/>
-          </w:tcPr>
-          <w:p>
-            <w:r/>
-            <w:r>
-              <w:rPr>
-                <w:sz w:val="18"/>
-              </w:rPr>
-              <w:t>Asks the plan for its criteria (stratum C) (n = 35)</w:t>
-            </w:r>
-          </w:p>
-        </w:tc>
-        <w:tc>
-          <w:tcPr>
-            <w:tcW w:type="dxa" w:w="1440"/>
-          </w:tcPr>
-          <w:p>
-            <w:r/>
-            <w:r>
-              <w:rPr>
-                <w:sz w:val="18"/>
-              </w:rPr>
-              <w:t>35 (100%)</w:t>
-            </w:r>
-          </w:p>
-        </w:tc>
-        <w:tc>
-          <w:tcPr>
-            <w:tcW w:type="dxa" w:w="1440"/>
-          </w:tcPr>
-          <w:p>
-            <w:r/>
-            <w:r>
-              <w:rPr>
-                <w:sz w:val="18"/>
-              </w:rPr>
-              <w:t>35 (100%)</w:t>
-            </w:r>
-          </w:p>
-        </w:tc>
-        <w:tc>
-          <w:tcPr>
-            <w:tcW w:type="dxa" w:w="1440"/>
-          </w:tcPr>
-          <w:p>
-            <w:r/>
-            <w:r>
-              <w:rPr>
-                <w:sz w:val="18"/>
-              </w:rPr>
-              <w:t>35 (100%)</w:t>
-            </w:r>
-          </w:p>
-        </w:tc>
-        <w:tc>
-          <w:tcPr>
-            <w:tcW w:type="dxa" w:w="1440"/>
-          </w:tcPr>
-          <w:p>
-            <w:r/>
-            <w:r>
-              <w:rPr>
-                <w:sz w:val="18"/>
-              </w:rPr>
-              <w:t>2 (6%)</w:t>
-            </w:r>
-          </w:p>
-        </w:tc>
-        <w:tc>
-          <w:tcPr>
-            <w:tcW w:type="dxa" w:w="1440"/>
-          </w:tcPr>
-          <w:p>
-            <w:r/>
-            <w:r>
-              <w:rPr>
-                <w:sz w:val="18"/>
-              </w:rPr>
-              <w:t>99.0; P &lt; 0.001</w:t>
-            </w:r>
-          </w:p>
-        </w:tc>
-      </w:tr>
-      <w:tr>
-        <w:tc>
-          <w:tcPr>
-            <w:tcW w:type="dxa" w:w="1440"/>
-          </w:tcPr>
-          <w:p>
-            <w:r/>
-            <w:r>
-              <w:rPr>
-                <w:sz w:val="18"/>
-              </w:rPr>
-              <w:t>Cites a nonexistent governing document (stratum C) (n = 35)</w:t>
-            </w:r>
-          </w:p>
-        </w:tc>
-        <w:tc>
-          <w:tcPr>
-            <w:tcW w:type="dxa" w:w="1440"/>
-          </w:tcPr>
-          <w:p>
-            <w:r/>
-            <w:r>
-              <w:rPr>
-                <w:sz w:val="18"/>
-              </w:rPr>
-              <w:t>0 (0%)</w:t>
-            </w:r>
-          </w:p>
-        </w:tc>
-        <w:tc>
-          <w:tcPr>
-            <w:tcW w:type="dxa" w:w="1440"/>
-          </w:tcPr>
-          <w:p>
-            <w:r/>
-            <w:r>
-              <w:rPr>
-                <w:sz w:val="18"/>
-              </w:rPr>
-              <w:t>1 (3%)</w:t>
-            </w:r>
-          </w:p>
-        </w:tc>
-        <w:tc>
-          <w:tcPr>
-            <w:tcW w:type="dxa" w:w="1440"/>
-          </w:tcPr>
-          <w:p>
-            <w:r/>
-            <w:r>
-              <w:rPr>
-                <w:sz w:val="18"/>
-              </w:rPr>
-              <w:t>7 (20%)</w:t>
-            </w:r>
-          </w:p>
-        </w:tc>
-        <w:tc>
-          <w:tcPr>
-            <w:tcW w:type="dxa" w:w="1440"/>
-          </w:tcPr>
-          <w:p>
-            <w:r/>
-            <w:r>
-              <w:rPr>
-                <w:sz w:val="18"/>
-              </w:rPr>
-              <w:t>19 (54%)</w:t>
-            </w:r>
-          </w:p>
-        </w:tc>
-        <w:tc>
-          <w:tcPr>
-            <w:tcW w:type="dxa" w:w="1440"/>
-          </w:tcPr>
-          <w:p>
-            <w:r/>
-            <w:r>
-              <w:rPr>
-                <w:sz w:val="18"/>
-              </w:rPr>
-              <w:t>39.8; P &lt; 0.001</w:t>
-            </w:r>
-          </w:p>
-        </w:tc>
-      </w:tr>
-      <w:tr>
-        <w:tc>
-          <w:tcPr>
-            <w:tcW w:type="dxa" w:w="1440"/>
-          </w:tcPr>
-          <w:p>
-            <w:r/>
-            <w:r>
-              <w:rPr>
-                <w:sz w:val="18"/>
-              </w:rPr>
-              <w:t>Rule attributed to the plan without a source (judged) (n = 167)</w:t>
-            </w:r>
-          </w:p>
-        </w:tc>
-        <w:tc>
-          <w:tcPr>
-            <w:tcW w:type="dxa" w:w="1440"/>
-          </w:tcPr>
-          <w:p>
-            <w:r/>
-            <w:r>
-              <w:rPr>
-                <w:sz w:val="18"/>
-              </w:rPr>
-              <w:t>0 (0%)</w:t>
-            </w:r>
-          </w:p>
-        </w:tc>
-        <w:tc>
-          <w:tcPr>
-            <w:tcW w:type="dxa" w:w="1440"/>
-          </w:tcPr>
-          <w:p>
-            <w:r/>
-            <w:r>
-              <w:rPr>
-                <w:sz w:val="18"/>
-              </w:rPr>
-              <w:t>10 (6%)</w:t>
-            </w:r>
-          </w:p>
-        </w:tc>
-        <w:tc>
-          <w:tcPr>
-            <w:tcW w:type="dxa" w:w="1440"/>
-          </w:tcPr>
-          <w:p>
-            <w:r/>
-            <w:r>
-              <w:rPr>
-                <w:sz w:val="18"/>
-              </w:rPr>
-              <w:t>36 (22%)</w:t>
-            </w:r>
-          </w:p>
-        </w:tc>
-        <w:tc>
-          <w:tcPr>
-            <w:tcW w:type="dxa" w:w="1440"/>
-          </w:tcPr>
-          <w:p>
-            <w:r/>
-            <w:r>
-              <w:rPr>
-                <w:sz w:val="18"/>
-              </w:rPr>
-              <w:t>42 (25%)</w:t>
-            </w:r>
-          </w:p>
-        </w:tc>
-        <w:tc>
-          <w:tcPr>
-            <w:tcW w:type="dxa" w:w="1440"/>
-          </w:tcPr>
-          <w:p>
-            <w:r/>
-            <w:r>
-              <w:rPr>
-                <w:sz w:val="18"/>
-              </w:rPr>
-              <w:t>61.7; P &lt; 0.001</w:t>
-            </w:r>
-          </w:p>
-        </w:tc>
-      </w:tr>
-      <w:tr>
-        <w:tc>
-          <w:tcPr>
-            <w:tcW w:type="dxa" w:w="1440"/>
-          </w:tcPr>
-          <w:p>
-            <w:r/>
-            <w:r>
-              <w:rPr>
-                <w:sz w:val="18"/>
-              </w:rPr>
-              <w:t>Completeness, judged, mean (0–4), all letters</w:t>
-            </w:r>
-          </w:p>
-        </w:tc>
-        <w:tc>
-          <w:tcPr>
-            <w:tcW w:type="dxa" w:w="1440"/>
-          </w:tcPr>
-          <w:p>
-            <w:r/>
-            <w:r>
-              <w:rPr>
-                <w:sz w:val="18"/>
-              </w:rPr>
-              <w:t>3.99</w:t>
-            </w:r>
-          </w:p>
-        </w:tc>
-        <w:tc>
-          <w:tcPr>
-            <w:tcW w:type="dxa" w:w="1440"/>
-          </w:tcPr>
-          <w:p>
-            <w:r/>
-            <w:r>
-              <w:rPr>
-                <w:sz w:val="18"/>
-              </w:rPr>
-              <w:t>3.00</w:t>
-            </w:r>
-          </w:p>
-        </w:tc>
-        <w:tc>
-          <w:tcPr>
-            <w:tcW w:type="dxa" w:w="1440"/>
-          </w:tcPr>
-          <w:p>
-            <w:r/>
-            <w:r>
-              <w:rPr>
-                <w:sz w:val="18"/>
-              </w:rPr>
-              <w:t>3.38</w:t>
-            </w:r>
-          </w:p>
-        </w:tc>
-        <w:tc>
-          <w:tcPr>
-            <w:tcW w:type="dxa" w:w="1440"/>
-          </w:tcPr>
-          <w:p>
-            <w:r/>
-            <w:r>
-              <w:rPr>
-                <w:sz w:val="18"/>
-              </w:rPr>
-              <w:t>2.91</w:t>
-            </w:r>
-          </w:p>
-        </w:tc>
-        <w:tc>
-          <w:tcPr>
-            <w:tcW w:type="dxa" w:w="1440"/>
-          </w:tcPr>
-          <w:p>
-            <w:r/>
-            <w:r>
-              <w:rPr>
-                <w:sz w:val="18"/>
-              </w:rPr>
-              <w:t>Friedman χ² = 203.1; P &lt; 0.001</w:t>
-            </w:r>
-          </w:p>
-        </w:tc>
-      </w:tr>
-    </w:tbl>
-    <w:p/>
-    <w:p>
-      <w:r>
-        <w:rPr>
-          <w:b/>
-          <w:i w:val="0"/>
-        </w:rPr>
-        <w:t>Table 4. Pairwise comparisons of appeal-letter outcomes (exact McNemar test on discordant pairs)</w:t>
+        <w:t>Table 2. Appeal-letter outcomes and pairwise comparisons (exact McNemar test on discordant pairs)</w:t>
       </w:r>
     </w:p>
     <w:tbl>
@@ -3661,7 +1970,7 @@
                 <w:b/>
                 <w:sz w:val="18"/>
               </w:rPr>
-              <w:t>Outcome / comparison</w:t>
+              <w:t>Outcome and comparison</w:t>
             </w:r>
           </w:p>
         </w:tc>
@@ -3722,7 +2031,7 @@
               <w:rPr>
                 <w:sz w:val="18"/>
               </w:rPr>
-              <w:t>Quotes a criterion answering the denial reason (stratum A) (n = 120)</w:t>
+              <w:t>Quotes a criterion answering the denial reason (stratum A) (n = 120). OrthoAppeals 99%, ChatGPT 25%, Claude 67%, Gemini 91%. Cochran's Q = 176.0, P &lt; 0.001</w:t>
             </w:r>
           </w:p>
         </w:tc>
@@ -4125,7 +2434,7 @@
               <w:rPr>
                 <w:sz w:val="18"/>
               </w:rPr>
-              <w:t>Any quotation not found in the policy (stratum A) (n = 120)</w:t>
+              <w:t>Hallucinated quotation (stratum A) (n = 120). OrthoAppeals 0%, ChatGPT 8%, Claude 46%, Gemini 42%. Cochran's Q = 107.9, P &lt; 0.001</w:t>
             </w:r>
           </w:p>
         </w:tc>
@@ -4528,7 +2837,7 @@
               <w:rPr>
                 <w:sz w:val="18"/>
               </w:rPr>
-              <w:t>Cites the governing policy in the letter (stratum A) (n = 120)</w:t>
+              <w:t>Hallucinated policy number or effective date (n = 167). OrthoAppeals 0%, ChatGPT 5%, Claude 19%, Gemini 20%. Cochran's Q = 61.8, P &lt; 0.001</w:t>
             </w:r>
           </w:p>
         </w:tc>
@@ -4597,35 +2906,35 @@
               <w:rPr>
                 <w:sz w:val="18"/>
               </w:rPr>
-              <w:t>50 / 0</w:t>
-            </w:r>
-          </w:p>
-        </w:tc>
-        <w:tc>
-          <w:tcPr>
-            <w:tcW w:type="dxa" w:w="2160"/>
-          </w:tcPr>
-          <w:p>
-            <w:r/>
-            <w:r>
-              <w:rPr>
-                <w:sz w:val="18"/>
-              </w:rPr>
-              <w:t>+42 (+32 to +51)</w:t>
-            </w:r>
-          </w:p>
-        </w:tc>
-        <w:tc>
-          <w:tcPr>
-            <w:tcW w:type="dxa" w:w="2160"/>
-          </w:tcPr>
-          <w:p>
-            <w:r/>
-            <w:r>
-              <w:rPr>
-                <w:sz w:val="18"/>
-              </w:rPr>
-              <w:t>P &lt; 0.001</w:t>
+              <w:t>0 / 8</w:t>
+            </w:r>
+          </w:p>
+        </w:tc>
+        <w:tc>
+          <w:tcPr>
+            <w:tcW w:type="dxa" w:w="2160"/>
+          </w:tcPr>
+          <w:p>
+            <w:r/>
+            <w:r>
+              <w:rPr>
+                <w:sz w:val="18"/>
+              </w:rPr>
+              <w:t>-5 (-8 to -2)</w:t>
+            </w:r>
+          </w:p>
+        </w:tc>
+        <w:tc>
+          <w:tcPr>
+            <w:tcW w:type="dxa" w:w="2160"/>
+          </w:tcPr>
+          <w:p>
+            <w:r/>
+            <w:r>
+              <w:rPr>
+                <w:sz w:val="18"/>
+              </w:rPr>
+              <w:t>P = 0.02</w:t>
             </w:r>
           </w:p>
         </w:tc>
@@ -4655,35 +2964,35 @@
               <w:rPr>
                 <w:sz w:val="18"/>
               </w:rPr>
-              <w:t>9 / 0</w:t>
-            </w:r>
-          </w:p>
-        </w:tc>
-        <w:tc>
-          <w:tcPr>
-            <w:tcW w:type="dxa" w:w="2160"/>
-          </w:tcPr>
-          <w:p>
-            <w:r/>
-            <w:r>
-              <w:rPr>
-                <w:sz w:val="18"/>
-              </w:rPr>
-              <w:t>+7 (+3 to +12)</w:t>
-            </w:r>
-          </w:p>
-        </w:tc>
-        <w:tc>
-          <w:tcPr>
-            <w:tcW w:type="dxa" w:w="2160"/>
-          </w:tcPr>
-          <w:p>
-            <w:r/>
-            <w:r>
-              <w:rPr>
-                <w:sz w:val="18"/>
-              </w:rPr>
-              <w:t>P = 0.01</w:t>
+              <w:t>0 / 32</w:t>
+            </w:r>
+          </w:p>
+        </w:tc>
+        <w:tc>
+          <w:tcPr>
+            <w:tcW w:type="dxa" w:w="2160"/>
+          </w:tcPr>
+          <w:p>
+            <w:r/>
+            <w:r>
+              <w:rPr>
+                <w:sz w:val="18"/>
+              </w:rPr>
+              <w:t>-19 (-25 to -13)</w:t>
+            </w:r>
+          </w:p>
+        </w:tc>
+        <w:tc>
+          <w:tcPr>
+            <w:tcW w:type="dxa" w:w="2160"/>
+          </w:tcPr>
+          <w:p>
+            <w:r/>
+            <w:r>
+              <w:rPr>
+                <w:sz w:val="18"/>
+              </w:rPr>
+              <w:t>P &lt; 0.001</w:t>
             </w:r>
           </w:p>
         </w:tc>
@@ -4713,35 +3022,35 @@
               <w:rPr>
                 <w:sz w:val="18"/>
               </w:rPr>
-              <w:t>3 / 0</w:t>
-            </w:r>
-          </w:p>
-        </w:tc>
-        <w:tc>
-          <w:tcPr>
-            <w:tcW w:type="dxa" w:w="2160"/>
-          </w:tcPr>
-          <w:p>
-            <w:r/>
-            <w:r>
-              <w:rPr>
-                <w:sz w:val="18"/>
-              </w:rPr>
-              <w:t>+3 (+0 to +6)</w:t>
-            </w:r>
-          </w:p>
-        </w:tc>
-        <w:tc>
-          <w:tcPr>
-            <w:tcW w:type="dxa" w:w="2160"/>
-          </w:tcPr>
-          <w:p>
-            <w:r/>
-            <w:r>
-              <w:rPr>
-                <w:sz w:val="18"/>
-              </w:rPr>
-              <w:t>P = 0.25</w:t>
+              <w:t>0 / 34</w:t>
+            </w:r>
+          </w:p>
+        </w:tc>
+        <w:tc>
+          <w:tcPr>
+            <w:tcW w:type="dxa" w:w="2160"/>
+          </w:tcPr>
+          <w:p>
+            <w:r/>
+            <w:r>
+              <w:rPr>
+                <w:sz w:val="18"/>
+              </w:rPr>
+              <w:t>-20 (-26 to -14)</w:t>
+            </w:r>
+          </w:p>
+        </w:tc>
+        <w:tc>
+          <w:tcPr>
+            <w:tcW w:type="dxa" w:w="2160"/>
+          </w:tcPr>
+          <w:p>
+            <w:r/>
+            <w:r>
+              <w:rPr>
+                <w:sz w:val="18"/>
+              </w:rPr>
+              <w:t>P &lt; 0.001</w:t>
             </w:r>
           </w:p>
         </w:tc>
@@ -4771,21 +3080,21 @@
               <w:rPr>
                 <w:sz w:val="18"/>
               </w:rPr>
-              <w:t>0 / 41</w:t>
-            </w:r>
-          </w:p>
-        </w:tc>
-        <w:tc>
-          <w:tcPr>
-            <w:tcW w:type="dxa" w:w="2160"/>
-          </w:tcPr>
-          <w:p>
-            <w:r/>
-            <w:r>
-              <w:rPr>
-                <w:sz w:val="18"/>
-              </w:rPr>
-              <w:t>-34 (-42 to -26)</w:t>
+              <w:t>3 / 27</w:t>
+            </w:r>
+          </w:p>
+        </w:tc>
+        <w:tc>
+          <w:tcPr>
+            <w:tcW w:type="dxa" w:w="2160"/>
+          </w:tcPr>
+          <w:p>
+            <w:r/>
+            <w:r>
+              <w:rPr>
+                <w:sz w:val="18"/>
+              </w:rPr>
+              <w:t>-14 (-20 to -8)</w:t>
             </w:r>
           </w:p>
         </w:tc>
@@ -4829,21 +3138,21 @@
               <w:rPr>
                 <w:sz w:val="18"/>
               </w:rPr>
-              <w:t>0 / 47</w:t>
-            </w:r>
-          </w:p>
-        </w:tc>
-        <w:tc>
-          <w:tcPr>
-            <w:tcW w:type="dxa" w:w="2160"/>
-          </w:tcPr>
-          <w:p>
-            <w:r/>
-            <w:r>
-              <w:rPr>
-                <w:sz w:val="18"/>
-              </w:rPr>
-              <w:t>-39 (-48 to -31)</w:t>
+              <w:t>3 / 29</w:t>
+            </w:r>
+          </w:p>
+        </w:tc>
+        <w:tc>
+          <w:tcPr>
+            <w:tcW w:type="dxa" w:w="2160"/>
+          </w:tcPr>
+          <w:p>
+            <w:r/>
+            <w:r>
+              <w:rPr>
+                <w:sz w:val="18"/>
+              </w:rPr>
+              <w:t>-16 (-22 to -10)</w:t>
             </w:r>
           </w:p>
         </w:tc>
@@ -4887,35 +3196,35 @@
               <w:rPr>
                 <w:sz w:val="18"/>
               </w:rPr>
-              <w:t>1 / 7</w:t>
-            </w:r>
-          </w:p>
-        </w:tc>
-        <w:tc>
-          <w:tcPr>
-            <w:tcW w:type="dxa" w:w="2160"/>
-          </w:tcPr>
-          <w:p>
-            <w:r/>
-            <w:r>
-              <w:rPr>
-                <w:sz w:val="18"/>
-              </w:rPr>
-              <w:t>-5 (-10 to -1)</w:t>
-            </w:r>
-          </w:p>
-        </w:tc>
-        <w:tc>
-          <w:tcPr>
-            <w:tcW w:type="dxa" w:w="2160"/>
-          </w:tcPr>
-          <w:p>
-            <w:r/>
-            <w:r>
-              <w:rPr>
-                <w:sz w:val="18"/>
-              </w:rPr>
-              <w:t>P = 0.14</w:t>
+              <w:t>16 / 18</w:t>
+            </w:r>
+          </w:p>
+        </w:tc>
+        <w:tc>
+          <w:tcPr>
+            <w:tcW w:type="dxa" w:w="2160"/>
+          </w:tcPr>
+          <w:p>
+            <w:r/>
+            <w:r>
+              <w:rPr>
+                <w:sz w:val="18"/>
+              </w:rPr>
+              <w:t>-1 (-8 to +5)</w:t>
+            </w:r>
+          </w:p>
+        </w:tc>
+        <w:tc>
+          <w:tcPr>
+            <w:tcW w:type="dxa" w:w="2160"/>
+          </w:tcPr>
+          <w:p>
+            <w:r/>
+            <w:r>
+              <w:rPr>
+                <w:sz w:val="18"/>
+              </w:rPr>
+              <w:t>P = 0.86</w:t>
             </w:r>
           </w:p>
         </w:tc>
@@ -4931,7 +3240,7 @@
               <w:rPr>
                 <w:sz w:val="18"/>
               </w:rPr>
-              <w:t>Invented policy number or effective date (n = 167)</w:t>
+              <w:t>States the filing deadline (n = 167). OrthoAppeals 100%, ChatGPT 46%, Claude 95%, Gemini 14%. Cochran's Q = 313.0, P &lt; 0.001</w:t>
             </w:r>
           </w:p>
         </w:tc>
@@ -5000,35 +3309,35 @@
               <w:rPr>
                 <w:sz w:val="18"/>
               </w:rPr>
-              <w:t>0 / 8</w:t>
-            </w:r>
-          </w:p>
-        </w:tc>
-        <w:tc>
-          <w:tcPr>
-            <w:tcW w:type="dxa" w:w="2160"/>
-          </w:tcPr>
-          <w:p>
-            <w:r/>
-            <w:r>
-              <w:rPr>
-                <w:sz w:val="18"/>
-              </w:rPr>
-              <w:t>-5 (-8 to -2)</w:t>
-            </w:r>
-          </w:p>
-        </w:tc>
-        <w:tc>
-          <w:tcPr>
-            <w:tcW w:type="dxa" w:w="2160"/>
-          </w:tcPr>
-          <w:p>
-            <w:r/>
-            <w:r>
-              <w:rPr>
-                <w:sz w:val="18"/>
-              </w:rPr>
-              <w:t>P = 0.02</w:t>
+              <w:t>91 / 0</w:t>
+            </w:r>
+          </w:p>
+        </w:tc>
+        <w:tc>
+          <w:tcPr>
+            <w:tcW w:type="dxa" w:w="2160"/>
+          </w:tcPr>
+          <w:p>
+            <w:r/>
+            <w:r>
+              <w:rPr>
+                <w:sz w:val="18"/>
+              </w:rPr>
+              <w:t>+54 (+47 to +62)</w:t>
+            </w:r>
+          </w:p>
+        </w:tc>
+        <w:tc>
+          <w:tcPr>
+            <w:tcW w:type="dxa" w:w="2160"/>
+          </w:tcPr>
+          <w:p>
+            <w:r/>
+            <w:r>
+              <w:rPr>
+                <w:sz w:val="18"/>
+              </w:rPr>
+              <w:t>P &lt; 0.001</w:t>
             </w:r>
           </w:p>
         </w:tc>
@@ -5058,35 +3367,35 @@
               <w:rPr>
                 <w:sz w:val="18"/>
               </w:rPr>
-              <w:t>0 / 32</w:t>
-            </w:r>
-          </w:p>
-        </w:tc>
-        <w:tc>
-          <w:tcPr>
-            <w:tcW w:type="dxa" w:w="2160"/>
-          </w:tcPr>
-          <w:p>
-            <w:r/>
-            <w:r>
-              <w:rPr>
-                <w:sz w:val="18"/>
-              </w:rPr>
-              <w:t>-19 (-25 to -13)</w:t>
-            </w:r>
-          </w:p>
-        </w:tc>
-        <w:tc>
-          <w:tcPr>
-            <w:tcW w:type="dxa" w:w="2160"/>
-          </w:tcPr>
-          <w:p>
-            <w:r/>
-            <w:r>
-              <w:rPr>
-                <w:sz w:val="18"/>
-              </w:rPr>
-              <w:t>P &lt; 0.001</w:t>
+              <w:t>8 / 0</w:t>
+            </w:r>
+          </w:p>
+        </w:tc>
+        <w:tc>
+          <w:tcPr>
+            <w:tcW w:type="dxa" w:w="2160"/>
+          </w:tcPr>
+          <w:p>
+            <w:r/>
+            <w:r>
+              <w:rPr>
+                <w:sz w:val="18"/>
+              </w:rPr>
+              <w:t>+5 (+2 to +8)</w:t>
+            </w:r>
+          </w:p>
+        </w:tc>
+        <w:tc>
+          <w:tcPr>
+            <w:tcW w:type="dxa" w:w="2160"/>
+          </w:tcPr>
+          <w:p>
+            <w:r/>
+            <w:r>
+              <w:rPr>
+                <w:sz w:val="18"/>
+              </w:rPr>
+              <w:t>P = 0.008</w:t>
             </w:r>
           </w:p>
         </w:tc>
@@ -5116,21 +3425,21 @@
               <w:rPr>
                 <w:sz w:val="18"/>
               </w:rPr>
-              <w:t>0 / 34</w:t>
-            </w:r>
-          </w:p>
-        </w:tc>
-        <w:tc>
-          <w:tcPr>
-            <w:tcW w:type="dxa" w:w="2160"/>
-          </w:tcPr>
-          <w:p>
-            <w:r/>
-            <w:r>
-              <w:rPr>
-                <w:sz w:val="18"/>
-              </w:rPr>
-              <w:t>-20 (-26 to -14)</w:t>
+              <w:t>144 / 0</w:t>
+            </w:r>
+          </w:p>
+        </w:tc>
+        <w:tc>
+          <w:tcPr>
+            <w:tcW w:type="dxa" w:w="2160"/>
+          </w:tcPr>
+          <w:p>
+            <w:r/>
+            <w:r>
+              <w:rPr>
+                <w:sz w:val="18"/>
+              </w:rPr>
+              <w:t>+86 (+81 to +91)</w:t>
             </w:r>
           </w:p>
         </w:tc>
@@ -5174,21 +3483,21 @@
               <w:rPr>
                 <w:sz w:val="18"/>
               </w:rPr>
-              <w:t>3 / 27</w:t>
-            </w:r>
-          </w:p>
-        </w:tc>
-        <w:tc>
-          <w:tcPr>
-            <w:tcW w:type="dxa" w:w="2160"/>
-          </w:tcPr>
-          <w:p>
-            <w:r/>
-            <w:r>
-              <w:rPr>
-                <w:sz w:val="18"/>
-              </w:rPr>
-              <w:t>-14 (-20 to -8)</w:t>
+              <w:t>3 / 86</w:t>
+            </w:r>
+          </w:p>
+        </w:tc>
+        <w:tc>
+          <w:tcPr>
+            <w:tcW w:type="dxa" w:w="2160"/>
+          </w:tcPr>
+          <w:p>
+            <w:r/>
+            <w:r>
+              <w:rPr>
+                <w:sz w:val="18"/>
+              </w:rPr>
+              <w:t>-50 (-58 to -41)</w:t>
             </w:r>
           </w:p>
         </w:tc>
@@ -5232,21 +3541,21 @@
               <w:rPr>
                 <w:sz w:val="18"/>
               </w:rPr>
-              <w:t>3 / 29</w:t>
-            </w:r>
-          </w:p>
-        </w:tc>
-        <w:tc>
-          <w:tcPr>
-            <w:tcW w:type="dxa" w:w="2160"/>
-          </w:tcPr>
-          <w:p>
-            <w:r/>
-            <w:r>
-              <w:rPr>
-                <w:sz w:val="18"/>
-              </w:rPr>
-              <w:t>-16 (-22 to -10)</w:t>
+              <w:t>66 / 13</w:t>
+            </w:r>
+          </w:p>
+        </w:tc>
+        <w:tc>
+          <w:tcPr>
+            <w:tcW w:type="dxa" w:w="2160"/>
+          </w:tcPr>
+          <w:p>
+            <w:r/>
+            <w:r>
+              <w:rPr>
+                <w:sz w:val="18"/>
+              </w:rPr>
+              <w:t>+32 (+22 to +41)</w:t>
             </w:r>
           </w:p>
         </w:tc>
@@ -5290,35 +3599,35 @@
               <w:rPr>
                 <w:sz w:val="18"/>
               </w:rPr>
-              <w:t>16 / 18</w:t>
-            </w:r>
-          </w:p>
-        </w:tc>
-        <w:tc>
-          <w:tcPr>
-            <w:tcW w:type="dxa" w:w="2160"/>
-          </w:tcPr>
-          <w:p>
-            <w:r/>
-            <w:r>
-              <w:rPr>
-                <w:sz w:val="18"/>
-              </w:rPr>
-              <w:t>-1 (-8 to +5)</w:t>
-            </w:r>
-          </w:p>
-        </w:tc>
-        <w:tc>
-          <w:tcPr>
-            <w:tcW w:type="dxa" w:w="2160"/>
-          </w:tcPr>
-          <w:p>
-            <w:r/>
-            <w:r>
-              <w:rPr>
-                <w:sz w:val="18"/>
-              </w:rPr>
-              <w:t>P = 0.86</w:t>
+              <w:t>137 / 1</w:t>
+            </w:r>
+          </w:p>
+        </w:tc>
+        <w:tc>
+          <w:tcPr>
+            <w:tcW w:type="dxa" w:w="2160"/>
+          </w:tcPr>
+          <w:p>
+            <w:r/>
+            <w:r>
+              <w:rPr>
+                <w:sz w:val="18"/>
+              </w:rPr>
+              <w:t>+81 (+75 to +87)</w:t>
+            </w:r>
+          </w:p>
+        </w:tc>
+        <w:tc>
+          <w:tcPr>
+            <w:tcW w:type="dxa" w:w="2160"/>
+          </w:tcPr>
+          <w:p>
+            <w:r/>
+            <w:r>
+              <w:rPr>
+                <w:sz w:val="18"/>
+              </w:rPr>
+              <w:t>P &lt; 0.001</w:t>
             </w:r>
           </w:p>
         </w:tc>
@@ -5334,7 +3643,7 @@
               <w:rPr>
                 <w:sz w:val="18"/>
               </w:rPr>
-              <w:t>States the filing deadline (n = 167)</w:t>
+              <w:t>States where to send the appeal (n = 167). OrthoAppeals 99%, ChatGPT 68%, Claude 99%, Gemini 92%. Cochran's Q = 114.2, P &lt; 0.001</w:t>
             </w:r>
           </w:p>
         </w:tc>
@@ -5403,21 +3712,21 @@
               <w:rPr>
                 <w:sz w:val="18"/>
               </w:rPr>
-              <w:t>91 / 0</w:t>
-            </w:r>
-          </w:p>
-        </w:tc>
-        <w:tc>
-          <w:tcPr>
-            <w:tcW w:type="dxa" w:w="2160"/>
-          </w:tcPr>
-          <w:p>
-            <w:r/>
-            <w:r>
-              <w:rPr>
-                <w:sz w:val="18"/>
-              </w:rPr>
-              <w:t>+54 (+47 to +62)</w:t>
+              <w:t>52 / 0</w:t>
+            </w:r>
+          </w:p>
+        </w:tc>
+        <w:tc>
+          <w:tcPr>
+            <w:tcW w:type="dxa" w:w="2160"/>
+          </w:tcPr>
+          <w:p>
+            <w:r/>
+            <w:r>
+              <w:rPr>
+                <w:sz w:val="18"/>
+              </w:rPr>
+              <w:t>+31 (+24 to +38)</w:t>
             </w:r>
           </w:p>
         </w:tc>
@@ -5461,35 +3770,35 @@
               <w:rPr>
                 <w:sz w:val="18"/>
               </w:rPr>
-              <w:t>8 / 0</w:t>
-            </w:r>
-          </w:p>
-        </w:tc>
-        <w:tc>
-          <w:tcPr>
-            <w:tcW w:type="dxa" w:w="2160"/>
-          </w:tcPr>
-          <w:p>
-            <w:r/>
-            <w:r>
-              <w:rPr>
-                <w:sz w:val="18"/>
-              </w:rPr>
-              <w:t>+5 (+2 to +8)</w:t>
-            </w:r>
-          </w:p>
-        </w:tc>
-        <w:tc>
-          <w:tcPr>
-            <w:tcW w:type="dxa" w:w="2160"/>
-          </w:tcPr>
-          <w:p>
-            <w:r/>
-            <w:r>
-              <w:rPr>
-                <w:sz w:val="18"/>
-              </w:rPr>
-              <w:t>P = 0.008</w:t>
+              <w:t>1 / 2</w:t>
+            </w:r>
+          </w:p>
+        </w:tc>
+        <w:tc>
+          <w:tcPr>
+            <w:tcW w:type="dxa" w:w="2160"/>
+          </w:tcPr>
+          <w:p>
+            <w:r/>
+            <w:r>
+              <w:rPr>
+                <w:sz w:val="18"/>
+              </w:rPr>
+              <w:t>-1 (-3 to +1)</w:t>
+            </w:r>
+          </w:p>
+        </w:tc>
+        <w:tc>
+          <w:tcPr>
+            <w:tcW w:type="dxa" w:w="2160"/>
+          </w:tcPr>
+          <w:p>
+            <w:r/>
+            <w:r>
+              <w:rPr>
+                <w:sz w:val="18"/>
+              </w:rPr>
+              <w:t>P = 1.00</w:t>
             </w:r>
           </w:p>
         </w:tc>
@@ -5519,35 +3828,35 @@
               <w:rPr>
                 <w:sz w:val="18"/>
               </w:rPr>
-              <w:t>144 / 0</w:t>
-            </w:r>
-          </w:p>
-        </w:tc>
-        <w:tc>
-          <w:tcPr>
-            <w:tcW w:type="dxa" w:w="2160"/>
-          </w:tcPr>
-          <w:p>
-            <w:r/>
-            <w:r>
-              <w:rPr>
-                <w:sz w:val="18"/>
-              </w:rPr>
-              <w:t>+86 (+81 to +91)</w:t>
-            </w:r>
-          </w:p>
-        </w:tc>
-        <w:tc>
-          <w:tcPr>
-            <w:tcW w:type="dxa" w:w="2160"/>
-          </w:tcPr>
-          <w:p>
-            <w:r/>
-            <w:r>
-              <w:rPr>
-                <w:sz w:val="18"/>
-              </w:rPr>
-              <w:t>P &lt; 0.001</w:t>
+              <w:t>13 / 2</w:t>
+            </w:r>
+          </w:p>
+        </w:tc>
+        <w:tc>
+          <w:tcPr>
+            <w:tcW w:type="dxa" w:w="2160"/>
+          </w:tcPr>
+          <w:p>
+            <w:r/>
+            <w:r>
+              <w:rPr>
+                <w:sz w:val="18"/>
+              </w:rPr>
+              <w:t>+7 (+2 to +11)</w:t>
+            </w:r>
+          </w:p>
+        </w:tc>
+        <w:tc>
+          <w:tcPr>
+            <w:tcW w:type="dxa" w:w="2160"/>
+          </w:tcPr>
+          <w:p>
+            <w:r/>
+            <w:r>
+              <w:rPr>
+                <w:sz w:val="18"/>
+              </w:rPr>
+              <w:t>P = 0.01</w:t>
             </w:r>
           </w:p>
         </w:tc>
@@ -5577,21 +3886,21 @@
               <w:rPr>
                 <w:sz w:val="18"/>
               </w:rPr>
-              <w:t>3 / 86</w:t>
-            </w:r>
-          </w:p>
-        </w:tc>
-        <w:tc>
-          <w:tcPr>
-            <w:tcW w:type="dxa" w:w="2160"/>
-          </w:tcPr>
-          <w:p>
-            <w:r/>
-            <w:r>
-              <w:rPr>
-                <w:sz w:val="18"/>
-              </w:rPr>
-              <w:t>-50 (-58 to -41)</w:t>
+              <w:t>0 / 53</w:t>
+            </w:r>
+          </w:p>
+        </w:tc>
+        <w:tc>
+          <w:tcPr>
+            <w:tcW w:type="dxa" w:w="2160"/>
+          </w:tcPr>
+          <w:p>
+            <w:r/>
+            <w:r>
+              <w:rPr>
+                <w:sz w:val="18"/>
+              </w:rPr>
+              <w:t>-32 (-39 to -25)</w:t>
             </w:r>
           </w:p>
         </w:tc>
@@ -5635,21 +3944,21 @@
               <w:rPr>
                 <w:sz w:val="18"/>
               </w:rPr>
-              <w:t>66 / 13</w:t>
-            </w:r>
-          </w:p>
-        </w:tc>
-        <w:tc>
-          <w:tcPr>
-            <w:tcW w:type="dxa" w:w="2160"/>
-          </w:tcPr>
-          <w:p>
-            <w:r/>
-            <w:r>
-              <w:rPr>
-                <w:sz w:val="18"/>
-              </w:rPr>
-              <w:t>+32 (+22 to +41)</w:t>
+              <w:t>9 / 50</w:t>
+            </w:r>
+          </w:p>
+        </w:tc>
+        <w:tc>
+          <w:tcPr>
+            <w:tcW w:type="dxa" w:w="2160"/>
+          </w:tcPr>
+          <w:p>
+            <w:r/>
+            <w:r>
+              <w:rPr>
+                <w:sz w:val="18"/>
+              </w:rPr>
+              <w:t>-25 (-33 to -16)</w:t>
             </w:r>
           </w:p>
         </w:tc>
@@ -5693,35 +4002,35 @@
               <w:rPr>
                 <w:sz w:val="18"/>
               </w:rPr>
-              <w:t>137 / 1</w:t>
-            </w:r>
-          </w:p>
-        </w:tc>
-        <w:tc>
-          <w:tcPr>
-            <w:tcW w:type="dxa" w:w="2160"/>
-          </w:tcPr>
-          <w:p>
-            <w:r/>
-            <w:r>
-              <w:rPr>
-                <w:sz w:val="18"/>
-              </w:rPr>
-              <w:t>+81 (+75 to +87)</w:t>
-            </w:r>
-          </w:p>
-        </w:tc>
-        <w:tc>
-          <w:tcPr>
-            <w:tcW w:type="dxa" w:w="2160"/>
-          </w:tcPr>
-          <w:p>
-            <w:r/>
-            <w:r>
-              <w:rPr>
-                <w:sz w:val="18"/>
-              </w:rPr>
-              <w:t>P &lt; 0.001</w:t>
+              <w:t>13 / 1</w:t>
+            </w:r>
+          </w:p>
+        </w:tc>
+        <w:tc>
+          <w:tcPr>
+            <w:tcW w:type="dxa" w:w="2160"/>
+          </w:tcPr>
+          <w:p>
+            <w:r/>
+            <w:r>
+              <w:rPr>
+                <w:sz w:val="18"/>
+              </w:rPr>
+              <w:t>+7 (+3 to +12)</w:t>
+            </w:r>
+          </w:p>
+        </w:tc>
+        <w:tc>
+          <w:tcPr>
+            <w:tcW w:type="dxa" w:w="2160"/>
+          </w:tcPr>
+          <w:p>
+            <w:r/>
+            <w:r>
+              <w:rPr>
+                <w:sz w:val="18"/>
+              </w:rPr>
+              <w:t>P = 0.005</w:t>
             </w:r>
           </w:p>
         </w:tc>
@@ -5737,7 +4046,7 @@
               <w:rPr>
                 <w:sz w:val="18"/>
               </w:rPr>
-              <w:t>States the appeal route (n = 167)</w:t>
+              <w:t>Ready to send (n = 167). OrthoAppeals 100%, ChatGPT 91%, Claude 100%, Gemini 100%. Cochran's Q = 45.0, P &lt; 0.001</w:t>
             </w:r>
           </w:p>
         </w:tc>
@@ -5806,21 +4115,21 @@
               <w:rPr>
                 <w:sz w:val="18"/>
               </w:rPr>
-              <w:t>52 / 0</w:t>
-            </w:r>
-          </w:p>
-        </w:tc>
-        <w:tc>
-          <w:tcPr>
-            <w:tcW w:type="dxa" w:w="2160"/>
-          </w:tcPr>
-          <w:p>
-            <w:r/>
-            <w:r>
-              <w:rPr>
-                <w:sz w:val="18"/>
-              </w:rPr>
-              <w:t>+31 (+24 to +38)</w:t>
+              <w:t>15 / 0</w:t>
+            </w:r>
+          </w:p>
+        </w:tc>
+        <w:tc>
+          <w:tcPr>
+            <w:tcW w:type="dxa" w:w="2160"/>
+          </w:tcPr>
+          <w:p>
+            <w:r/>
+            <w:r>
+              <w:rPr>
+                <w:sz w:val="18"/>
+              </w:rPr>
+              <w:t>+9 (+5 to +14)</w:t>
             </w:r>
           </w:p>
         </w:tc>
@@ -5864,21 +4173,21 @@
               <w:rPr>
                 <w:sz w:val="18"/>
               </w:rPr>
-              <w:t>1 / 2</w:t>
-            </w:r>
-          </w:p>
-        </w:tc>
-        <w:tc>
-          <w:tcPr>
-            <w:tcW w:type="dxa" w:w="2160"/>
-          </w:tcPr>
-          <w:p>
-            <w:r/>
-            <w:r>
-              <w:rPr>
-                <w:sz w:val="18"/>
-              </w:rPr>
-              <w:t>-1 (-3 to +1)</w:t>
+              <w:t>0 / 0</w:t>
+            </w:r>
+          </w:p>
+        </w:tc>
+        <w:tc>
+          <w:tcPr>
+            <w:tcW w:type="dxa" w:w="2160"/>
+          </w:tcPr>
+          <w:p>
+            <w:r/>
+            <w:r>
+              <w:rPr>
+                <w:sz w:val="18"/>
+              </w:rPr>
+              <w:t>+0 (+0 to +0)</w:t>
             </w:r>
           </w:p>
         </w:tc>
@@ -5922,35 +4231,35 @@
               <w:rPr>
                 <w:sz w:val="18"/>
               </w:rPr>
-              <w:t>13 / 2</w:t>
-            </w:r>
-          </w:p>
-        </w:tc>
-        <w:tc>
-          <w:tcPr>
-            <w:tcW w:type="dxa" w:w="2160"/>
-          </w:tcPr>
-          <w:p>
-            <w:r/>
-            <w:r>
-              <w:rPr>
-                <w:sz w:val="18"/>
-              </w:rPr>
-              <w:t>+7 (+2 to +11)</w:t>
-            </w:r>
-          </w:p>
-        </w:tc>
-        <w:tc>
-          <w:tcPr>
-            <w:tcW w:type="dxa" w:w="2160"/>
-          </w:tcPr>
-          <w:p>
-            <w:r/>
-            <w:r>
-              <w:rPr>
-                <w:sz w:val="18"/>
-              </w:rPr>
-              <w:t>P = 0.01</w:t>
+              <w:t>0 / 0</w:t>
+            </w:r>
+          </w:p>
+        </w:tc>
+        <w:tc>
+          <w:tcPr>
+            <w:tcW w:type="dxa" w:w="2160"/>
+          </w:tcPr>
+          <w:p>
+            <w:r/>
+            <w:r>
+              <w:rPr>
+                <w:sz w:val="18"/>
+              </w:rPr>
+              <w:t>+0 (+0 to +0)</w:t>
+            </w:r>
+          </w:p>
+        </w:tc>
+        <w:tc>
+          <w:tcPr>
+            <w:tcW w:type="dxa" w:w="2160"/>
+          </w:tcPr>
+          <w:p>
+            <w:r/>
+            <w:r>
+              <w:rPr>
+                <w:sz w:val="18"/>
+              </w:rPr>
+              <w:t>P = 1.00</w:t>
             </w:r>
           </w:p>
         </w:tc>
@@ -5980,21 +4289,21 @@
               <w:rPr>
                 <w:sz w:val="18"/>
               </w:rPr>
-              <w:t>0 / 53</w:t>
-            </w:r>
-          </w:p>
-        </w:tc>
-        <w:tc>
-          <w:tcPr>
-            <w:tcW w:type="dxa" w:w="2160"/>
-          </w:tcPr>
-          <w:p>
-            <w:r/>
-            <w:r>
-              <w:rPr>
-                <w:sz w:val="18"/>
-              </w:rPr>
-              <w:t>-32 (-39 to -25)</w:t>
+              <w:t>0 / 15</w:t>
+            </w:r>
+          </w:p>
+        </w:tc>
+        <w:tc>
+          <w:tcPr>
+            <w:tcW w:type="dxa" w:w="2160"/>
+          </w:tcPr>
+          <w:p>
+            <w:r/>
+            <w:r>
+              <w:rPr>
+                <w:sz w:val="18"/>
+              </w:rPr>
+              <w:t>-9 (-14 to -5)</w:t>
             </w:r>
           </w:p>
         </w:tc>
@@ -6038,21 +4347,21 @@
               <w:rPr>
                 <w:sz w:val="18"/>
               </w:rPr>
-              <w:t>9 / 50</w:t>
-            </w:r>
-          </w:p>
-        </w:tc>
-        <w:tc>
-          <w:tcPr>
-            <w:tcW w:type="dxa" w:w="2160"/>
-          </w:tcPr>
-          <w:p>
-            <w:r/>
-            <w:r>
-              <w:rPr>
-                <w:sz w:val="18"/>
-              </w:rPr>
-              <w:t>-25 (-33 to -16)</w:t>
+              <w:t>0 / 15</w:t>
+            </w:r>
+          </w:p>
+        </w:tc>
+        <w:tc>
+          <w:tcPr>
+            <w:tcW w:type="dxa" w:w="2160"/>
+          </w:tcPr>
+          <w:p>
+            <w:r/>
+            <w:r>
+              <w:rPr>
+                <w:sz w:val="18"/>
+              </w:rPr>
+              <w:t>-9 (-14 to -5)</w:t>
             </w:r>
           </w:p>
         </w:tc>
@@ -6096,35 +4405,35 @@
               <w:rPr>
                 <w:sz w:val="18"/>
               </w:rPr>
-              <w:t>13 / 1</w:t>
-            </w:r>
-          </w:p>
-        </w:tc>
-        <w:tc>
-          <w:tcPr>
-            <w:tcW w:type="dxa" w:w="2160"/>
-          </w:tcPr>
-          <w:p>
-            <w:r/>
-            <w:r>
-              <w:rPr>
-                <w:sz w:val="18"/>
-              </w:rPr>
-              <w:t>+7 (+3 to +12)</w:t>
-            </w:r>
-          </w:p>
-        </w:tc>
-        <w:tc>
-          <w:tcPr>
-            <w:tcW w:type="dxa" w:w="2160"/>
-          </w:tcPr>
-          <w:p>
-            <w:r/>
-            <w:r>
-              <w:rPr>
-                <w:sz w:val="18"/>
-              </w:rPr>
-              <w:t>P = 0.005</w:t>
+              <w:t>0 / 0</w:t>
+            </w:r>
+          </w:p>
+        </w:tc>
+        <w:tc>
+          <w:tcPr>
+            <w:tcW w:type="dxa" w:w="2160"/>
+          </w:tcPr>
+          <w:p>
+            <w:r/>
+            <w:r>
+              <w:rPr>
+                <w:sz w:val="18"/>
+              </w:rPr>
+              <w:t>+0 (+0 to +0)</w:t>
+            </w:r>
+          </w:p>
+        </w:tc>
+        <w:tc>
+          <w:tcPr>
+            <w:tcW w:type="dxa" w:w="2160"/>
+          </w:tcPr>
+          <w:p>
+            <w:r/>
+            <w:r>
+              <w:rPr>
+                <w:sz w:val="18"/>
+              </w:rPr>
+              <w:t>P = 1.00</w:t>
             </w:r>
           </w:p>
         </w:tc>
@@ -6140,7 +4449,7 @@
               <w:rPr>
                 <w:sz w:val="18"/>
               </w:rPr>
-              <w:t>Sendable: identifiers present, no placeholders (n = 167)</w:t>
+              <w:t>Asks the plan for its criteria (stratum C) (n = 35). OrthoAppeals 100%, ChatGPT 100%, Claude 100%, Gemini 6%. Cochran's Q = 99.0, P &lt; 0.001</w:t>
             </w:r>
           </w:p>
         </w:tc>
@@ -6209,35 +4518,35 @@
               <w:rPr>
                 <w:sz w:val="18"/>
               </w:rPr>
-              <w:t>15 / 0</w:t>
-            </w:r>
-          </w:p>
-        </w:tc>
-        <w:tc>
-          <w:tcPr>
-            <w:tcW w:type="dxa" w:w="2160"/>
-          </w:tcPr>
-          <w:p>
-            <w:r/>
-            <w:r>
-              <w:rPr>
-                <w:sz w:val="18"/>
-              </w:rPr>
-              <w:t>+9 (+5 to +14)</w:t>
-            </w:r>
-          </w:p>
-        </w:tc>
-        <w:tc>
-          <w:tcPr>
-            <w:tcW w:type="dxa" w:w="2160"/>
-          </w:tcPr>
-          <w:p>
-            <w:r/>
-            <w:r>
-              <w:rPr>
-                <w:sz w:val="18"/>
-              </w:rPr>
-              <w:t>P &lt; 0.001</w:t>
+              <w:t>0 / 0</w:t>
+            </w:r>
+          </w:p>
+        </w:tc>
+        <w:tc>
+          <w:tcPr>
+            <w:tcW w:type="dxa" w:w="2160"/>
+          </w:tcPr>
+          <w:p>
+            <w:r/>
+            <w:r>
+              <w:rPr>
+                <w:sz w:val="18"/>
+              </w:rPr>
+              <w:t>+0 (+0 to +0)</w:t>
+            </w:r>
+          </w:p>
+        </w:tc>
+        <w:tc>
+          <w:tcPr>
+            <w:tcW w:type="dxa" w:w="2160"/>
+          </w:tcPr>
+          <w:p>
+            <w:r/>
+            <w:r>
+              <w:rPr>
+                <w:sz w:val="18"/>
+              </w:rPr>
+              <w:t>P = 1.00</w:t>
             </w:r>
           </w:p>
         </w:tc>
@@ -6325,35 +4634,35 @@
               <w:rPr>
                 <w:sz w:val="18"/>
               </w:rPr>
-              <w:t>0 / 0</w:t>
-            </w:r>
-          </w:p>
-        </w:tc>
-        <w:tc>
-          <w:tcPr>
-            <w:tcW w:type="dxa" w:w="2160"/>
-          </w:tcPr>
-          <w:p>
-            <w:r/>
-            <w:r>
-              <w:rPr>
-                <w:sz w:val="18"/>
-              </w:rPr>
-              <w:t>+0 (+0 to +0)</w:t>
-            </w:r>
-          </w:p>
-        </w:tc>
-        <w:tc>
-          <w:tcPr>
-            <w:tcW w:type="dxa" w:w="2160"/>
-          </w:tcPr>
-          <w:p>
-            <w:r/>
-            <w:r>
-              <w:rPr>
-                <w:sz w:val="18"/>
-              </w:rPr>
-              <w:t>P = 1.00</w:t>
+              <w:t>33 / 0</w:t>
+            </w:r>
+          </w:p>
+        </w:tc>
+        <w:tc>
+          <w:tcPr>
+            <w:tcW w:type="dxa" w:w="2160"/>
+          </w:tcPr>
+          <w:p>
+            <w:r/>
+            <w:r>
+              <w:rPr>
+                <w:sz w:val="18"/>
+              </w:rPr>
+              <w:t>+94 (+86 to +100)</w:t>
+            </w:r>
+          </w:p>
+        </w:tc>
+        <w:tc>
+          <w:tcPr>
+            <w:tcW w:type="dxa" w:w="2160"/>
+          </w:tcPr>
+          <w:p>
+            <w:r/>
+            <w:r>
+              <w:rPr>
+                <w:sz w:val="18"/>
+              </w:rPr>
+              <w:t>P &lt; 0.001</w:t>
             </w:r>
           </w:p>
         </w:tc>
@@ -6383,35 +4692,35 @@
               <w:rPr>
                 <w:sz w:val="18"/>
               </w:rPr>
-              <w:t>0 / 15</w:t>
-            </w:r>
-          </w:p>
-        </w:tc>
-        <w:tc>
-          <w:tcPr>
-            <w:tcW w:type="dxa" w:w="2160"/>
-          </w:tcPr>
-          <w:p>
-            <w:r/>
-            <w:r>
-              <w:rPr>
-                <w:sz w:val="18"/>
-              </w:rPr>
-              <w:t>-9 (-14 to -5)</w:t>
-            </w:r>
-          </w:p>
-        </w:tc>
-        <w:tc>
-          <w:tcPr>
-            <w:tcW w:type="dxa" w:w="2160"/>
-          </w:tcPr>
-          <w:p>
-            <w:r/>
-            <w:r>
-              <w:rPr>
-                <w:sz w:val="18"/>
-              </w:rPr>
-              <w:t>P &lt; 0.001</w:t>
+              <w:t>0 / 0</w:t>
+            </w:r>
+          </w:p>
+        </w:tc>
+        <w:tc>
+          <w:tcPr>
+            <w:tcW w:type="dxa" w:w="2160"/>
+          </w:tcPr>
+          <w:p>
+            <w:r/>
+            <w:r>
+              <w:rPr>
+                <w:sz w:val="18"/>
+              </w:rPr>
+              <w:t>+0 (+0 to +0)</w:t>
+            </w:r>
+          </w:p>
+        </w:tc>
+        <w:tc>
+          <w:tcPr>
+            <w:tcW w:type="dxa" w:w="2160"/>
+          </w:tcPr>
+          <w:p>
+            <w:r/>
+            <w:r>
+              <w:rPr>
+                <w:sz w:val="18"/>
+              </w:rPr>
+              <w:t>P = 1.00</w:t>
             </w:r>
           </w:p>
         </w:tc>
@@ -6441,21 +4750,21 @@
               <w:rPr>
                 <w:sz w:val="18"/>
               </w:rPr>
-              <w:t>0 / 15</w:t>
-            </w:r>
-          </w:p>
-        </w:tc>
-        <w:tc>
-          <w:tcPr>
-            <w:tcW w:type="dxa" w:w="2160"/>
-          </w:tcPr>
-          <w:p>
-            <w:r/>
-            <w:r>
-              <w:rPr>
-                <w:sz w:val="18"/>
-              </w:rPr>
-              <w:t>-9 (-14 to -5)</w:t>
+              <w:t>33 / 0</w:t>
+            </w:r>
+          </w:p>
+        </w:tc>
+        <w:tc>
+          <w:tcPr>
+            <w:tcW w:type="dxa" w:w="2160"/>
+          </w:tcPr>
+          <w:p>
+            <w:r/>
+            <w:r>
+              <w:rPr>
+                <w:sz w:val="18"/>
+              </w:rPr>
+              <w:t>+94 (+86 to +100)</w:t>
             </w:r>
           </w:p>
         </w:tc>
@@ -6499,35 +4808,35 @@
               <w:rPr>
                 <w:sz w:val="18"/>
               </w:rPr>
-              <w:t>0 / 0</w:t>
-            </w:r>
-          </w:p>
-        </w:tc>
-        <w:tc>
-          <w:tcPr>
-            <w:tcW w:type="dxa" w:w="2160"/>
-          </w:tcPr>
-          <w:p>
-            <w:r/>
-            <w:r>
-              <w:rPr>
-                <w:sz w:val="18"/>
-              </w:rPr>
-              <w:t>+0 (+0 to +0)</w:t>
-            </w:r>
-          </w:p>
-        </w:tc>
-        <w:tc>
-          <w:tcPr>
-            <w:tcW w:type="dxa" w:w="2160"/>
-          </w:tcPr>
-          <w:p>
-            <w:r/>
-            <w:r>
-              <w:rPr>
-                <w:sz w:val="18"/>
-              </w:rPr>
-              <w:t>P = 1.00</w:t>
+              <w:t>33 / 0</w:t>
+            </w:r>
+          </w:p>
+        </w:tc>
+        <w:tc>
+          <w:tcPr>
+            <w:tcW w:type="dxa" w:w="2160"/>
+          </w:tcPr>
+          <w:p>
+            <w:r/>
+            <w:r>
+              <w:rPr>
+                <w:sz w:val="18"/>
+              </w:rPr>
+              <w:t>+94 (+86 to +100)</w:t>
+            </w:r>
+          </w:p>
+        </w:tc>
+        <w:tc>
+          <w:tcPr>
+            <w:tcW w:type="dxa" w:w="2160"/>
+          </w:tcPr>
+          <w:p>
+            <w:r/>
+            <w:r>
+              <w:rPr>
+                <w:sz w:val="18"/>
+              </w:rPr>
+              <w:t>P &lt; 0.001</w:t>
             </w:r>
           </w:p>
         </w:tc>
@@ -6543,7 +4852,7 @@
               <w:rPr>
                 <w:sz w:val="18"/>
               </w:rPr>
-              <w:t>Asks the plan for its criteria (stratum C) (n = 35)</w:t>
+              <w:t>Cites a policy that does not exist (stratum C) (n = 35). OrthoAppeals 0%, ChatGPT 3%, Claude 20%, Gemini 54%. Cochran's Q = 39.8, P &lt; 0.001</w:t>
             </w:r>
           </w:p>
         </w:tc>
@@ -6612,21 +4921,21 @@
               <w:rPr>
                 <w:sz w:val="18"/>
               </w:rPr>
-              <w:t>0 / 0</w:t>
-            </w:r>
-          </w:p>
-        </w:tc>
-        <w:tc>
-          <w:tcPr>
-            <w:tcW w:type="dxa" w:w="2160"/>
-          </w:tcPr>
-          <w:p>
-            <w:r/>
-            <w:r>
-              <w:rPr>
-                <w:sz w:val="18"/>
-              </w:rPr>
-              <w:t>+0 (+0 to +0)</w:t>
+              <w:t>0 / 1</w:t>
+            </w:r>
+          </w:p>
+        </w:tc>
+        <w:tc>
+          <w:tcPr>
+            <w:tcW w:type="dxa" w:w="2160"/>
+          </w:tcPr>
+          <w:p>
+            <w:r/>
+            <w:r>
+              <w:rPr>
+                <w:sz w:val="18"/>
+              </w:rPr>
+              <w:t>-3 (-9 to +0)</w:t>
             </w:r>
           </w:p>
         </w:tc>
@@ -6670,35 +4979,35 @@
               <w:rPr>
                 <w:sz w:val="18"/>
               </w:rPr>
-              <w:t>0 / 0</w:t>
-            </w:r>
-          </w:p>
-        </w:tc>
-        <w:tc>
-          <w:tcPr>
-            <w:tcW w:type="dxa" w:w="2160"/>
-          </w:tcPr>
-          <w:p>
-            <w:r/>
-            <w:r>
-              <w:rPr>
-                <w:sz w:val="18"/>
-              </w:rPr>
-              <w:t>+0 (+0 to +0)</w:t>
-            </w:r>
-          </w:p>
-        </w:tc>
-        <w:tc>
-          <w:tcPr>
-            <w:tcW w:type="dxa" w:w="2160"/>
-          </w:tcPr>
-          <w:p>
-            <w:r/>
-            <w:r>
-              <w:rPr>
-                <w:sz w:val="18"/>
-              </w:rPr>
-              <w:t>P = 1.00</w:t>
+              <w:t>0 / 7</w:t>
+            </w:r>
+          </w:p>
+        </w:tc>
+        <w:tc>
+          <w:tcPr>
+            <w:tcW w:type="dxa" w:w="2160"/>
+          </w:tcPr>
+          <w:p>
+            <w:r/>
+            <w:r>
+              <w:rPr>
+                <w:sz w:val="18"/>
+              </w:rPr>
+              <w:t>-20 (-34 to -9)</w:t>
+            </w:r>
+          </w:p>
+        </w:tc>
+        <w:tc>
+          <w:tcPr>
+            <w:tcW w:type="dxa" w:w="2160"/>
+          </w:tcPr>
+          <w:p>
+            <w:r/>
+            <w:r>
+              <w:rPr>
+                <w:sz w:val="18"/>
+              </w:rPr>
+              <w:t>P = 0.05</w:t>
             </w:r>
           </w:p>
         </w:tc>
@@ -6728,21 +5037,21 @@
               <w:rPr>
                 <w:sz w:val="18"/>
               </w:rPr>
-              <w:t>33 / 0</w:t>
-            </w:r>
-          </w:p>
-        </w:tc>
-        <w:tc>
-          <w:tcPr>
-            <w:tcW w:type="dxa" w:w="2160"/>
-          </w:tcPr>
-          <w:p>
-            <w:r/>
-            <w:r>
-              <w:rPr>
-                <w:sz w:val="18"/>
-              </w:rPr>
-              <w:t>+94 (+86 to +100)</w:t>
+              <w:t>0 / 19</w:t>
+            </w:r>
+          </w:p>
+        </w:tc>
+        <w:tc>
+          <w:tcPr>
+            <w:tcW w:type="dxa" w:w="2160"/>
+          </w:tcPr>
+          <w:p>
+            <w:r/>
+            <w:r>
+              <w:rPr>
+                <w:sz w:val="18"/>
+              </w:rPr>
+              <w:t>-54 (-71 to -37)</w:t>
             </w:r>
           </w:p>
         </w:tc>
@@ -6786,35 +5095,35 @@
               <w:rPr>
                 <w:sz w:val="18"/>
               </w:rPr>
-              <w:t>0 / 0</w:t>
-            </w:r>
-          </w:p>
-        </w:tc>
-        <w:tc>
-          <w:tcPr>
-            <w:tcW w:type="dxa" w:w="2160"/>
-          </w:tcPr>
-          <w:p>
-            <w:r/>
-            <w:r>
-              <w:rPr>
-                <w:sz w:val="18"/>
-              </w:rPr>
-              <w:t>+0 (+0 to +0)</w:t>
-            </w:r>
-          </w:p>
-        </w:tc>
-        <w:tc>
-          <w:tcPr>
-            <w:tcW w:type="dxa" w:w="2160"/>
-          </w:tcPr>
-          <w:p>
-            <w:r/>
-            <w:r>
-              <w:rPr>
-                <w:sz w:val="18"/>
-              </w:rPr>
-              <w:t>P = 1.00</w:t>
+              <w:t>1 / 7</w:t>
+            </w:r>
+          </w:p>
+        </w:tc>
+        <w:tc>
+          <w:tcPr>
+            <w:tcW w:type="dxa" w:w="2160"/>
+          </w:tcPr>
+          <w:p>
+            <w:r/>
+            <w:r>
+              <w:rPr>
+                <w:sz w:val="18"/>
+              </w:rPr>
+              <w:t>-17 (-31 to -3)</w:t>
+            </w:r>
+          </w:p>
+        </w:tc>
+        <w:tc>
+          <w:tcPr>
+            <w:tcW w:type="dxa" w:w="2160"/>
+          </w:tcPr>
+          <w:p>
+            <w:r/>
+            <w:r>
+              <w:rPr>
+                <w:sz w:val="18"/>
+              </w:rPr>
+              <w:t>P = 0.14</w:t>
             </w:r>
           </w:p>
         </w:tc>
@@ -6844,21 +5153,21 @@
               <w:rPr>
                 <w:sz w:val="18"/>
               </w:rPr>
-              <w:t>33 / 0</w:t>
-            </w:r>
-          </w:p>
-        </w:tc>
-        <w:tc>
-          <w:tcPr>
-            <w:tcW w:type="dxa" w:w="2160"/>
-          </w:tcPr>
-          <w:p>
-            <w:r/>
-            <w:r>
-              <w:rPr>
-                <w:sz w:val="18"/>
-              </w:rPr>
-              <w:t>+94 (+86 to +100)</w:t>
+              <w:t>1 / 19</w:t>
+            </w:r>
+          </w:p>
+        </w:tc>
+        <w:tc>
+          <w:tcPr>
+            <w:tcW w:type="dxa" w:w="2160"/>
+          </w:tcPr>
+          <w:p>
+            <w:r/>
+            <w:r>
+              <w:rPr>
+                <w:sz w:val="18"/>
+              </w:rPr>
+              <w:t>-51 (-69 to -31)</w:t>
             </w:r>
           </w:p>
         </w:tc>
@@ -6902,409 +5211,6 @@
               <w:rPr>
                 <w:sz w:val="18"/>
               </w:rPr>
-              <w:t>33 / 0</w:t>
-            </w:r>
-          </w:p>
-        </w:tc>
-        <w:tc>
-          <w:tcPr>
-            <w:tcW w:type="dxa" w:w="2160"/>
-          </w:tcPr>
-          <w:p>
-            <w:r/>
-            <w:r>
-              <w:rPr>
-                <w:sz w:val="18"/>
-              </w:rPr>
-              <w:t>+94 (+86 to +100)</w:t>
-            </w:r>
-          </w:p>
-        </w:tc>
-        <w:tc>
-          <w:tcPr>
-            <w:tcW w:type="dxa" w:w="2160"/>
-          </w:tcPr>
-          <w:p>
-            <w:r/>
-            <w:r>
-              <w:rPr>
-                <w:sz w:val="18"/>
-              </w:rPr>
-              <w:t>P &lt; 0.001</w:t>
-            </w:r>
-          </w:p>
-        </w:tc>
-      </w:tr>
-      <w:tr>
-        <w:tc>
-          <w:tcPr>
-            <w:tcW w:type="dxa" w:w="2160"/>
-          </w:tcPr>
-          <w:p>
-            <w:r/>
-            <w:r>
-              <w:rPr>
-                <w:sz w:val="18"/>
-              </w:rPr>
-              <w:t>Cites a nonexistent governing document (stratum C) (n = 35)</w:t>
-            </w:r>
-          </w:p>
-        </w:tc>
-        <w:tc>
-          <w:tcPr>
-            <w:tcW w:type="dxa" w:w="2160"/>
-          </w:tcPr>
-          <w:p>
-            <w:r/>
-            <w:r>
-              <w:rPr>
-                <w:sz w:val="18"/>
-              </w:rPr>
-            </w:r>
-          </w:p>
-        </w:tc>
-        <w:tc>
-          <w:tcPr>
-            <w:tcW w:type="dxa" w:w="2160"/>
-          </w:tcPr>
-          <w:p>
-            <w:r/>
-            <w:r>
-              <w:rPr>
-                <w:sz w:val="18"/>
-              </w:rPr>
-            </w:r>
-          </w:p>
-        </w:tc>
-        <w:tc>
-          <w:tcPr>
-            <w:tcW w:type="dxa" w:w="2160"/>
-          </w:tcPr>
-          <w:p>
-            <w:r/>
-            <w:r>
-              <w:rPr>
-                <w:sz w:val="18"/>
-              </w:rPr>
-            </w:r>
-          </w:p>
-        </w:tc>
-      </w:tr>
-      <w:tr>
-        <w:tc>
-          <w:tcPr>
-            <w:tcW w:type="dxa" w:w="2160"/>
-          </w:tcPr>
-          <w:p>
-            <w:r/>
-            <w:r>
-              <w:rPr>
-                <w:sz w:val="18"/>
-              </w:rPr>
-              <w:t xml:space="preserve">   OrthoAppeals vs ChatGPT</w:t>
-            </w:r>
-          </w:p>
-        </w:tc>
-        <w:tc>
-          <w:tcPr>
-            <w:tcW w:type="dxa" w:w="2160"/>
-          </w:tcPr>
-          <w:p>
-            <w:r/>
-            <w:r>
-              <w:rPr>
-                <w:sz w:val="18"/>
-              </w:rPr>
-              <w:t>0 / 1</w:t>
-            </w:r>
-          </w:p>
-        </w:tc>
-        <w:tc>
-          <w:tcPr>
-            <w:tcW w:type="dxa" w:w="2160"/>
-          </w:tcPr>
-          <w:p>
-            <w:r/>
-            <w:r>
-              <w:rPr>
-                <w:sz w:val="18"/>
-              </w:rPr>
-              <w:t>-3 (-9 to +0)</w:t>
-            </w:r>
-          </w:p>
-        </w:tc>
-        <w:tc>
-          <w:tcPr>
-            <w:tcW w:type="dxa" w:w="2160"/>
-          </w:tcPr>
-          <w:p>
-            <w:r/>
-            <w:r>
-              <w:rPr>
-                <w:sz w:val="18"/>
-              </w:rPr>
-              <w:t>P = 1.00</w:t>
-            </w:r>
-          </w:p>
-        </w:tc>
-      </w:tr>
-      <w:tr>
-        <w:tc>
-          <w:tcPr>
-            <w:tcW w:type="dxa" w:w="2160"/>
-          </w:tcPr>
-          <w:p>
-            <w:r/>
-            <w:r>
-              <w:rPr>
-                <w:sz w:val="18"/>
-              </w:rPr>
-              <w:t xml:space="preserve">   OrthoAppeals vs Claude</w:t>
-            </w:r>
-          </w:p>
-        </w:tc>
-        <w:tc>
-          <w:tcPr>
-            <w:tcW w:type="dxa" w:w="2160"/>
-          </w:tcPr>
-          <w:p>
-            <w:r/>
-            <w:r>
-              <w:rPr>
-                <w:sz w:val="18"/>
-              </w:rPr>
-              <w:t>0 / 7</w:t>
-            </w:r>
-          </w:p>
-        </w:tc>
-        <w:tc>
-          <w:tcPr>
-            <w:tcW w:type="dxa" w:w="2160"/>
-          </w:tcPr>
-          <w:p>
-            <w:r/>
-            <w:r>
-              <w:rPr>
-                <w:sz w:val="18"/>
-              </w:rPr>
-              <w:t>-20 (-34 to -9)</w:t>
-            </w:r>
-          </w:p>
-        </w:tc>
-        <w:tc>
-          <w:tcPr>
-            <w:tcW w:type="dxa" w:w="2160"/>
-          </w:tcPr>
-          <w:p>
-            <w:r/>
-            <w:r>
-              <w:rPr>
-                <w:sz w:val="18"/>
-              </w:rPr>
-              <w:t>P = 0.05</w:t>
-            </w:r>
-          </w:p>
-        </w:tc>
-      </w:tr>
-      <w:tr>
-        <w:tc>
-          <w:tcPr>
-            <w:tcW w:type="dxa" w:w="2160"/>
-          </w:tcPr>
-          <w:p>
-            <w:r/>
-            <w:r>
-              <w:rPr>
-                <w:sz w:val="18"/>
-              </w:rPr>
-              <w:t xml:space="preserve">   OrthoAppeals vs Gemini</w:t>
-            </w:r>
-          </w:p>
-        </w:tc>
-        <w:tc>
-          <w:tcPr>
-            <w:tcW w:type="dxa" w:w="2160"/>
-          </w:tcPr>
-          <w:p>
-            <w:r/>
-            <w:r>
-              <w:rPr>
-                <w:sz w:val="18"/>
-              </w:rPr>
-              <w:t>0 / 19</w:t>
-            </w:r>
-          </w:p>
-        </w:tc>
-        <w:tc>
-          <w:tcPr>
-            <w:tcW w:type="dxa" w:w="2160"/>
-          </w:tcPr>
-          <w:p>
-            <w:r/>
-            <w:r>
-              <w:rPr>
-                <w:sz w:val="18"/>
-              </w:rPr>
-              <w:t>-54 (-71 to -37)</w:t>
-            </w:r>
-          </w:p>
-        </w:tc>
-        <w:tc>
-          <w:tcPr>
-            <w:tcW w:type="dxa" w:w="2160"/>
-          </w:tcPr>
-          <w:p>
-            <w:r/>
-            <w:r>
-              <w:rPr>
-                <w:sz w:val="18"/>
-              </w:rPr>
-              <w:t>P &lt; 0.001</w:t>
-            </w:r>
-          </w:p>
-        </w:tc>
-      </w:tr>
-      <w:tr>
-        <w:tc>
-          <w:tcPr>
-            <w:tcW w:type="dxa" w:w="2160"/>
-          </w:tcPr>
-          <w:p>
-            <w:r/>
-            <w:r>
-              <w:rPr>
-                <w:sz w:val="18"/>
-              </w:rPr>
-              <w:t xml:space="preserve">   ChatGPT vs Claude</w:t>
-            </w:r>
-          </w:p>
-        </w:tc>
-        <w:tc>
-          <w:tcPr>
-            <w:tcW w:type="dxa" w:w="2160"/>
-          </w:tcPr>
-          <w:p>
-            <w:r/>
-            <w:r>
-              <w:rPr>
-                <w:sz w:val="18"/>
-              </w:rPr>
-              <w:t>1 / 7</w:t>
-            </w:r>
-          </w:p>
-        </w:tc>
-        <w:tc>
-          <w:tcPr>
-            <w:tcW w:type="dxa" w:w="2160"/>
-          </w:tcPr>
-          <w:p>
-            <w:r/>
-            <w:r>
-              <w:rPr>
-                <w:sz w:val="18"/>
-              </w:rPr>
-              <w:t>-17 (-31 to -3)</w:t>
-            </w:r>
-          </w:p>
-        </w:tc>
-        <w:tc>
-          <w:tcPr>
-            <w:tcW w:type="dxa" w:w="2160"/>
-          </w:tcPr>
-          <w:p>
-            <w:r/>
-            <w:r>
-              <w:rPr>
-                <w:sz w:val="18"/>
-              </w:rPr>
-              <w:t>P = 0.14</w:t>
-            </w:r>
-          </w:p>
-        </w:tc>
-      </w:tr>
-      <w:tr>
-        <w:tc>
-          <w:tcPr>
-            <w:tcW w:type="dxa" w:w="2160"/>
-          </w:tcPr>
-          <w:p>
-            <w:r/>
-            <w:r>
-              <w:rPr>
-                <w:sz w:val="18"/>
-              </w:rPr>
-              <w:t xml:space="preserve">   ChatGPT vs Gemini</w:t>
-            </w:r>
-          </w:p>
-        </w:tc>
-        <w:tc>
-          <w:tcPr>
-            <w:tcW w:type="dxa" w:w="2160"/>
-          </w:tcPr>
-          <w:p>
-            <w:r/>
-            <w:r>
-              <w:rPr>
-                <w:sz w:val="18"/>
-              </w:rPr>
-              <w:t>1 / 19</w:t>
-            </w:r>
-          </w:p>
-        </w:tc>
-        <w:tc>
-          <w:tcPr>
-            <w:tcW w:type="dxa" w:w="2160"/>
-          </w:tcPr>
-          <w:p>
-            <w:r/>
-            <w:r>
-              <w:rPr>
-                <w:sz w:val="18"/>
-              </w:rPr>
-              <w:t>-51 (-69 to -31)</w:t>
-            </w:r>
-          </w:p>
-        </w:tc>
-        <w:tc>
-          <w:tcPr>
-            <w:tcW w:type="dxa" w:w="2160"/>
-          </w:tcPr>
-          <w:p>
-            <w:r/>
-            <w:r>
-              <w:rPr>
-                <w:sz w:val="18"/>
-              </w:rPr>
-              <w:t>P &lt; 0.001</w:t>
-            </w:r>
-          </w:p>
-        </w:tc>
-      </w:tr>
-      <w:tr>
-        <w:tc>
-          <w:tcPr>
-            <w:tcW w:type="dxa" w:w="2160"/>
-          </w:tcPr>
-          <w:p>
-            <w:r/>
-            <w:r>
-              <w:rPr>
-                <w:sz w:val="18"/>
-              </w:rPr>
-              <w:t xml:space="preserve">   Claude vs Gemini</w:t>
-            </w:r>
-          </w:p>
-        </w:tc>
-        <w:tc>
-          <w:tcPr>
-            <w:tcW w:type="dxa" w:w="2160"/>
-          </w:tcPr>
-          <w:p>
-            <w:r/>
-            <w:r>
-              <w:rPr>
-                <w:sz w:val="18"/>
-              </w:rPr>
               <w:t>1 / 13</w:t>
             </w:r>
           </w:p>
@@ -7334,409 +5240,6 @@
                 <w:sz w:val="18"/>
               </w:rPr>
               <w:t>P = 0.007</w:t>
-            </w:r>
-          </w:p>
-        </w:tc>
-      </w:tr>
-      <w:tr>
-        <w:tc>
-          <w:tcPr>
-            <w:tcW w:type="dxa" w:w="2160"/>
-          </w:tcPr>
-          <w:p>
-            <w:r/>
-            <w:r>
-              <w:rPr>
-                <w:sz w:val="18"/>
-              </w:rPr>
-              <w:t>Rule attributed to the plan without a source (judged) (n = 167)</w:t>
-            </w:r>
-          </w:p>
-        </w:tc>
-        <w:tc>
-          <w:tcPr>
-            <w:tcW w:type="dxa" w:w="2160"/>
-          </w:tcPr>
-          <w:p>
-            <w:r/>
-            <w:r>
-              <w:rPr>
-                <w:sz w:val="18"/>
-              </w:rPr>
-            </w:r>
-          </w:p>
-        </w:tc>
-        <w:tc>
-          <w:tcPr>
-            <w:tcW w:type="dxa" w:w="2160"/>
-          </w:tcPr>
-          <w:p>
-            <w:r/>
-            <w:r>
-              <w:rPr>
-                <w:sz w:val="18"/>
-              </w:rPr>
-            </w:r>
-          </w:p>
-        </w:tc>
-        <w:tc>
-          <w:tcPr>
-            <w:tcW w:type="dxa" w:w="2160"/>
-          </w:tcPr>
-          <w:p>
-            <w:r/>
-            <w:r>
-              <w:rPr>
-                <w:sz w:val="18"/>
-              </w:rPr>
-            </w:r>
-          </w:p>
-        </w:tc>
-      </w:tr>
-      <w:tr>
-        <w:tc>
-          <w:tcPr>
-            <w:tcW w:type="dxa" w:w="2160"/>
-          </w:tcPr>
-          <w:p>
-            <w:r/>
-            <w:r>
-              <w:rPr>
-                <w:sz w:val="18"/>
-              </w:rPr>
-              <w:t xml:space="preserve">   OrthoAppeals vs ChatGPT</w:t>
-            </w:r>
-          </w:p>
-        </w:tc>
-        <w:tc>
-          <w:tcPr>
-            <w:tcW w:type="dxa" w:w="2160"/>
-          </w:tcPr>
-          <w:p>
-            <w:r/>
-            <w:r>
-              <w:rPr>
-                <w:sz w:val="18"/>
-              </w:rPr>
-              <w:t>0 / 10</w:t>
-            </w:r>
-          </w:p>
-        </w:tc>
-        <w:tc>
-          <w:tcPr>
-            <w:tcW w:type="dxa" w:w="2160"/>
-          </w:tcPr>
-          <w:p>
-            <w:r/>
-            <w:r>
-              <w:rPr>
-                <w:sz w:val="18"/>
-              </w:rPr>
-              <w:t>-6 (-10 to -3)</w:t>
-            </w:r>
-          </w:p>
-        </w:tc>
-        <w:tc>
-          <w:tcPr>
-            <w:tcW w:type="dxa" w:w="2160"/>
-          </w:tcPr>
-          <w:p>
-            <w:r/>
-            <w:r>
-              <w:rPr>
-                <w:sz w:val="18"/>
-              </w:rPr>
-              <w:t>P = 0.004</w:t>
-            </w:r>
-          </w:p>
-        </w:tc>
-      </w:tr>
-      <w:tr>
-        <w:tc>
-          <w:tcPr>
-            <w:tcW w:type="dxa" w:w="2160"/>
-          </w:tcPr>
-          <w:p>
-            <w:r/>
-            <w:r>
-              <w:rPr>
-                <w:sz w:val="18"/>
-              </w:rPr>
-              <w:t xml:space="preserve">   OrthoAppeals vs Claude</w:t>
-            </w:r>
-          </w:p>
-        </w:tc>
-        <w:tc>
-          <w:tcPr>
-            <w:tcW w:type="dxa" w:w="2160"/>
-          </w:tcPr>
-          <w:p>
-            <w:r/>
-            <w:r>
-              <w:rPr>
-                <w:sz w:val="18"/>
-              </w:rPr>
-              <w:t>0 / 36</w:t>
-            </w:r>
-          </w:p>
-        </w:tc>
-        <w:tc>
-          <w:tcPr>
-            <w:tcW w:type="dxa" w:w="2160"/>
-          </w:tcPr>
-          <w:p>
-            <w:r/>
-            <w:r>
-              <w:rPr>
-                <w:sz w:val="18"/>
-              </w:rPr>
-              <w:t>-22 (-28 to -16)</w:t>
-            </w:r>
-          </w:p>
-        </w:tc>
-        <w:tc>
-          <w:tcPr>
-            <w:tcW w:type="dxa" w:w="2160"/>
-          </w:tcPr>
-          <w:p>
-            <w:r/>
-            <w:r>
-              <w:rPr>
-                <w:sz w:val="18"/>
-              </w:rPr>
-              <w:t>P &lt; 0.001</w:t>
-            </w:r>
-          </w:p>
-        </w:tc>
-      </w:tr>
-      <w:tr>
-        <w:tc>
-          <w:tcPr>
-            <w:tcW w:type="dxa" w:w="2160"/>
-          </w:tcPr>
-          <w:p>
-            <w:r/>
-            <w:r>
-              <w:rPr>
-                <w:sz w:val="18"/>
-              </w:rPr>
-              <w:t xml:space="preserve">   OrthoAppeals vs Gemini</w:t>
-            </w:r>
-          </w:p>
-        </w:tc>
-        <w:tc>
-          <w:tcPr>
-            <w:tcW w:type="dxa" w:w="2160"/>
-          </w:tcPr>
-          <w:p>
-            <w:r/>
-            <w:r>
-              <w:rPr>
-                <w:sz w:val="18"/>
-              </w:rPr>
-              <w:t>0 / 42</w:t>
-            </w:r>
-          </w:p>
-        </w:tc>
-        <w:tc>
-          <w:tcPr>
-            <w:tcW w:type="dxa" w:w="2160"/>
-          </w:tcPr>
-          <w:p>
-            <w:r/>
-            <w:r>
-              <w:rPr>
-                <w:sz w:val="18"/>
-              </w:rPr>
-              <w:t>-25 (-32 to -19)</w:t>
-            </w:r>
-          </w:p>
-        </w:tc>
-        <w:tc>
-          <w:tcPr>
-            <w:tcW w:type="dxa" w:w="2160"/>
-          </w:tcPr>
-          <w:p>
-            <w:r/>
-            <w:r>
-              <w:rPr>
-                <w:sz w:val="18"/>
-              </w:rPr>
-              <w:t>P &lt; 0.001</w:t>
-            </w:r>
-          </w:p>
-        </w:tc>
-      </w:tr>
-      <w:tr>
-        <w:tc>
-          <w:tcPr>
-            <w:tcW w:type="dxa" w:w="2160"/>
-          </w:tcPr>
-          <w:p>
-            <w:r/>
-            <w:r>
-              <w:rPr>
-                <w:sz w:val="18"/>
-              </w:rPr>
-              <w:t xml:space="preserve">   ChatGPT vs Claude</w:t>
-            </w:r>
-          </w:p>
-        </w:tc>
-        <w:tc>
-          <w:tcPr>
-            <w:tcW w:type="dxa" w:w="2160"/>
-          </w:tcPr>
-          <w:p>
-            <w:r/>
-            <w:r>
-              <w:rPr>
-                <w:sz w:val="18"/>
-              </w:rPr>
-              <w:t>9 / 35</w:t>
-            </w:r>
-          </w:p>
-        </w:tc>
-        <w:tc>
-          <w:tcPr>
-            <w:tcW w:type="dxa" w:w="2160"/>
-          </w:tcPr>
-          <w:p>
-            <w:r/>
-            <w:r>
-              <w:rPr>
-                <w:sz w:val="18"/>
-              </w:rPr>
-              <w:t>-16 (-23 to -8)</w:t>
-            </w:r>
-          </w:p>
-        </w:tc>
-        <w:tc>
-          <w:tcPr>
-            <w:tcW w:type="dxa" w:w="2160"/>
-          </w:tcPr>
-          <w:p>
-            <w:r/>
-            <w:r>
-              <w:rPr>
-                <w:sz w:val="18"/>
-              </w:rPr>
-              <w:t>P &lt; 0.001</w:t>
-            </w:r>
-          </w:p>
-        </w:tc>
-      </w:tr>
-      <w:tr>
-        <w:tc>
-          <w:tcPr>
-            <w:tcW w:type="dxa" w:w="2160"/>
-          </w:tcPr>
-          <w:p>
-            <w:r/>
-            <w:r>
-              <w:rPr>
-                <w:sz w:val="18"/>
-              </w:rPr>
-              <w:t xml:space="preserve">   ChatGPT vs Gemini</w:t>
-            </w:r>
-          </w:p>
-        </w:tc>
-        <w:tc>
-          <w:tcPr>
-            <w:tcW w:type="dxa" w:w="2160"/>
-          </w:tcPr>
-          <w:p>
-            <w:r/>
-            <w:r>
-              <w:rPr>
-                <w:sz w:val="18"/>
-              </w:rPr>
-              <w:t>8 / 40</w:t>
-            </w:r>
-          </w:p>
-        </w:tc>
-        <w:tc>
-          <w:tcPr>
-            <w:tcW w:type="dxa" w:w="2160"/>
-          </w:tcPr>
-          <w:p>
-            <w:r/>
-            <w:r>
-              <w:rPr>
-                <w:sz w:val="18"/>
-              </w:rPr>
-              <w:t>-19 (-27 to -11)</w:t>
-            </w:r>
-          </w:p>
-        </w:tc>
-        <w:tc>
-          <w:tcPr>
-            <w:tcW w:type="dxa" w:w="2160"/>
-          </w:tcPr>
-          <w:p>
-            <w:r/>
-            <w:r>
-              <w:rPr>
-                <w:sz w:val="18"/>
-              </w:rPr>
-              <w:t>P &lt; 0.001</w:t>
-            </w:r>
-          </w:p>
-        </w:tc>
-      </w:tr>
-      <w:tr>
-        <w:tc>
-          <w:tcPr>
-            <w:tcW w:type="dxa" w:w="2160"/>
-          </w:tcPr>
-          <w:p>
-            <w:r/>
-            <w:r>
-              <w:rPr>
-                <w:sz w:val="18"/>
-              </w:rPr>
-              <w:t xml:space="preserve">   Claude vs Gemini</w:t>
-            </w:r>
-          </w:p>
-        </w:tc>
-        <w:tc>
-          <w:tcPr>
-            <w:tcW w:type="dxa" w:w="2160"/>
-          </w:tcPr>
-          <w:p>
-            <w:r/>
-            <w:r>
-              <w:rPr>
-                <w:sz w:val="18"/>
-              </w:rPr>
-              <w:t>26 / 32</w:t>
-            </w:r>
-          </w:p>
-        </w:tc>
-        <w:tc>
-          <w:tcPr>
-            <w:tcW w:type="dxa" w:w="2160"/>
-          </w:tcPr>
-          <w:p>
-            <w:r/>
-            <w:r>
-              <w:rPr>
-                <w:sz w:val="18"/>
-              </w:rPr>
-              <w:t>-4 (-12 to +5)</w:t>
-            </w:r>
-          </w:p>
-        </w:tc>
-        <w:tc>
-          <w:tcPr>
-            <w:tcW w:type="dxa" w:w="2160"/>
-          </w:tcPr>
-          <w:p>
-            <w:r/>
-            <w:r>
-              <w:rPr>
-                <w:sz w:val="18"/>
-              </w:rPr>
-              <w:t>P = 0.51</w:t>
             </w:r>
           </w:p>
         </w:tc>
@@ -7745,10 +5248,9 @@
     <w:p>
       <w:r>
         <w:rPr>
-          <w:i w:val="0"/>
           <w:sz w:val="18"/>
         </w:rPr>
-        <w:t>Difference is first minus second, with bootstrap 95% CI. P values Holm-adjusted within each outcome.</w:t>
+        <w:t>Difference is first minus second with bootstrap 95% CI. P values are Holm-adjusted within each outcome.</w:t>
       </w:r>
     </w:p>
     <w:p/>
@@ -7756,9 +5258,8 @@
       <w:r>
         <w:rPr>
           <w:b/>
-          <w:i w:val="0"/>
         </w:rPr>
-        <w:t>Table 5. Completeness, effort and within-system subgroup tests</w:t>
+        <w:t>Table 3. Completeness, effort and within-system tests</w:t>
       </w:r>
     </w:p>
     <w:tbl>
@@ -7785,7 +5286,7 @@
                 <w:b/>
                 <w:sz w:val="18"/>
               </w:rPr>
-              <w:t>Measure / comparison</w:t>
+              <w:t>Measure and comparison</w:t>
             </w:r>
           </w:p>
         </w:tc>
@@ -7846,7 +5347,7 @@
               <w:rPr>
                 <w:sz w:val="18"/>
               </w:rPr>
-              <w:t>Completeness, 0–4 (Friedman χ² = 203.1, P &lt; 0.001)</w:t>
+              <w:t>Completeness, 0 to 4 (Friedman χ² = 203.1, P &lt; 0.001)</w:t>
             </w:r>
           </w:p>
         </w:tc>
@@ -8478,7 +5979,7 @@
               <w:rPr>
                 <w:sz w:val="18"/>
               </w:rPr>
-              <w:t>Page fetches per case (Friedman χ² = 91.2, P &lt; 0.001)</w:t>
+              <w:t>Page visits per case (Friedman χ² = 91.2, P &lt; 0.001)</w:t>
             </w:r>
           </w:p>
         </w:tc>
@@ -8707,7 +6208,7 @@
               <w:rPr>
                 <w:sz w:val="18"/>
               </w:rPr>
-              <w:t>Within-system subgroup tests (chi-square or Fisher's exact)</w:t>
+              <w:t>Within-system tests (correct/total per subgroup, chi-square or Fisher's exact test)</w:t>
             </w:r>
           </w:p>
         </w:tc>
@@ -8762,7 +6263,7 @@
               <w:rPr>
                 <w:sz w:val="18"/>
               </w:rPr>
-              <w:t xml:space="preserve">   Identification by stratum (A / B / C): OrthoAppeals</w:t>
+              <w:t xml:space="preserve">   Identification by stratum (A / B / C), OrthoAppeals</w:t>
             </w:r>
           </w:p>
         </w:tc>
@@ -8820,7 +6321,7 @@
               <w:rPr>
                 <w:sz w:val="18"/>
               </w:rPr>
-              <w:t xml:space="preserve">   Identification by stratum (A / B / C): ChatGPT</w:t>
+              <w:t xml:space="preserve">   Identification by stratum (A / B / C), ChatGPT</w:t>
             </w:r>
           </w:p>
         </w:tc>
@@ -8878,7 +6379,7 @@
               <w:rPr>
                 <w:sz w:val="18"/>
               </w:rPr>
-              <w:t xml:space="preserve">   Identification by stratum (A / B / C): Claude</w:t>
+              <w:t xml:space="preserve">   Identification by stratum (A / B / C), Claude</w:t>
             </w:r>
           </w:p>
         </w:tc>
@@ -8936,7 +6437,7 @@
               <w:rPr>
                 <w:sz w:val="18"/>
               </w:rPr>
-              <w:t xml:space="preserve">   Identification by stratum (A / B / C): Gemini</w:t>
+              <w:t xml:space="preserve">   Identification by stratum (A / B / C), Gemini</w:t>
             </w:r>
           </w:p>
         </w:tc>
@@ -8994,7 +6495,7 @@
               <w:rPr>
                 <w:sz w:val="18"/>
               </w:rPr>
-              <w:t xml:space="preserve">   Identification by plan type (commercial / Medicaid): OrthoAppeals</w:t>
+              <w:t xml:space="preserve">   Identification by plan type (commercial / Medicaid), OrthoAppeals</w:t>
             </w:r>
           </w:p>
         </w:tc>
@@ -9052,7 +6553,7 @@
               <w:rPr>
                 <w:sz w:val="18"/>
               </w:rPr>
-              <w:t xml:space="preserve">   Identification by plan type (commercial / Medicaid): ChatGPT</w:t>
+              <w:t xml:space="preserve">   Identification by plan type (commercial / Medicaid), ChatGPT</w:t>
             </w:r>
           </w:p>
         </w:tc>
@@ -9110,7 +6611,7 @@
               <w:rPr>
                 <w:sz w:val="18"/>
               </w:rPr>
-              <w:t xml:space="preserve">   Identification by plan type (commercial / Medicaid): Claude</w:t>
+              <w:t xml:space="preserve">   Identification by plan type (commercial / Medicaid), Claude</w:t>
             </w:r>
           </w:p>
         </w:tc>
@@ -9168,7 +6669,7 @@
               <w:rPr>
                 <w:sz w:val="18"/>
               </w:rPr>
-              <w:t xml:space="preserve">   Identification by plan type (commercial / Medicaid): Gemini</w:t>
+              <w:t xml:space="preserve">   Identification by plan type (commercial / Medicaid), Gemini</w:t>
             </w:r>
           </w:p>
         </w:tc>
@@ -9219,10 +6720,9 @@
     <w:p>
       <w:r>
         <w:rPr>
-          <w:i w:val="0"/>
           <w:sz w:val="18"/>
         </w:rPr>
-        <w:t>Completeness and effort: Friedman test across systems, pairwise Wilcoxon signed-rank tests with bootstrap 95% CI for the paired mean difference. Subgroup tests: counts are correct/total per subgroup; P values Holm-adjusted across the four systems.</w:t>
+        <w:t>Completeness and effort were compared with the Friedman test across systems and pairwise Wilcoxon signed-rank tests, with a bootstrap 95% CI for the paired mean difference. Within-system P values are Holm-adjusted across the four systems.</w:t>
       </w:r>
     </w:p>
     <w:p/>
@@ -9273,10 +6773,9 @@
     <w:p>
       <w:r>
         <w:rPr>
-          <w:i w:val="0"/>
           <w:sz w:val="20"/>
         </w:rPr>
-        <w:t>Figure 1. Study design. Every case was answered by all four systems; every comparison is paired on the same case.</w:t>
+        <w:t>Figure 1. Study design. Every case was answered by all four systems, and every comparison is paired on the same case.</w:t>
       </w:r>
     </w:p>
     <w:p>
@@ -9318,10 +6817,9 @@
     <w:p>
       <w:r>
         <w:rPr>
-          <w:i w:val="0"/>
           <w:sz w:val="20"/>
         </w:rPr>
-        <w:t>Figure 2. Policy identification, letter accuracy and effort. (a) Correct identification of the governing policy by stratum and overall. (b) Stratum-A letters quoting a criterion that answers the stated denial reason, letters with a quotation found in neither the governing nor the cited document, and letters (all strata) with an invented policy number or date. (c) Stratum-C letters citing a nonexistent document or asking the plan for its criteria, and letters (all strata) stating the filing deadline. (d) Median web searches and page fetches per case. Bars show proportions with Wilson 95% CIs (a–c) or medians with interquartile ranges (d).</w:t>
+        <w:t>Figure 2. Policy identification, letter accuracy and effort. (a) Correct identification of the governing policy by stratum and overall. (b) Stratum-A letters quoting a criterion that answers the denial reason, letters with a hallucinated quotation, and letters (all strata) with a hallucinated policy number or date. (c) Stratum-C letters citing a policy that does not exist or asking the plan for its criteria, and letters (all strata) stating the filing deadline. (d) Median web searches and page visits per case. Bars show proportions with Wilson 95% CIs (a to c) or medians with interquartile ranges (d).</w:t>
       </w:r>
     </w:p>
     <w:sectPr>

</xml_diff>